<commit_message>
feat(dashboard): Phase 1 - Universal Schema v2.0 with TDD
- RED: Created comprehensive test suite (19 tests) covering all schema sections
- GREEN: Implemented UniversalSchemaV2, SchemaValidatorV2, ProjectTypeDetector, SchemaMigrator
- Tests: 19/19 passing (100% coverage of schema structure and validation)

Features:
- Schema v2.0 with 13 sections (metadata, architecture, frontend, backend, database, infrastructure, etc.)
- Project type detection (full-stack, API, frontend, database, microservices, library)
- Backward compatibility with v1 schema
- V1 to V2 migration with data preservation
- Validation for all project types (luum-fresh, TCBULK examples)

TDD Cycle: RED  GREEN complete
Next: REFACTOR phase (code review and optimization)
</commit_message>
<xml_diff>
--- a/docs/demo/COPILOT IN ACTION.docx
+++ b/docs/demo/COPILOT IN ACTION.docx
@@ -2,14 +2,6 @@
 <file path=word/document.xml><?xml version="1.0" encoding="utf-8"?>
 <w:document xmlns:wpc="http://schemas.microsoft.com/office/word/2010/wordprocessingCanvas" xmlns:cx="http://schemas.microsoft.com/office/drawing/2014/chartex" xmlns:cx1="http://schemas.microsoft.com/office/drawing/2015/9/8/chartex" xmlns:cx2="http://schemas.microsoft.com/office/drawing/2015/10/21/chartex" xmlns:cx3="http://schemas.microsoft.com/office/drawing/2016/5/9/chartex" xmlns:cx4="http://schemas.microsoft.com/office/drawing/2016/5/10/chartex" xmlns:cx5="http://schemas.microsoft.com/office/drawing/2016/5/11/chartex" xmlns:cx6="http://schemas.microsoft.com/office/drawing/2016/5/12/chartex" xmlns:cx7="http://schemas.microsoft.com/office/drawing/2016/5/13/chartex" xmlns:cx8="http://schemas.microsoft.com/office/drawing/2016/5/14/chartex" xmlns:mc="http://schemas.openxmlformats.org/markup-compatibility/2006" xmlns:aink="http://schemas.microsoft.com/office/drawing/2016/ink" xmlns:am3d="http://schemas.microsoft.com/office/drawing/2017/model3d" xmlns:o="urn:schemas-microsoft-com:office:office" xmlns:oel="http://schemas.microsoft.com/office/2019/extlst" xmlns:r="http://schemas.openxmlformats.org/officeDocument/2006/relationships" xmlns:m="http://schemas.openxmlformats.org/officeDocument/2006/math" xmlns:v="urn:schemas-microsoft-com:vml" xmlns:wp14="http://schemas.microsoft.com/office/word/2010/wordprocessingDrawing" xmlns:wp="http://schemas.openxmlformats.org/drawingml/2006/wordprocessingDrawing" xmlns:w10="urn:schemas-microsoft-com:office:word" xmlns:w="http://schemas.openxmlformats.org/wordprocessingml/2006/main" xmlns:w14="http://schemas.microsoft.com/office/word/2010/wordml" xmlns:w15="http://schemas.microsoft.com/office/word/2012/wordml" xmlns:w16cex="http://schemas.microsoft.com/office/word/2018/wordml/cex" xmlns:w16cid="http://schemas.microsoft.com/office/word/2016/wordml/cid" xmlns:w16="http://schemas.microsoft.com/office/word/2018/wordml" xmlns:w16du="http://schemas.microsoft.com/office/word/2023/wordml/word16du" xmlns:w16sdtdh="http://schemas.microsoft.com/office/word/2020/wordml/sdtdatahash" xmlns:w16sdtfl="http://schemas.microsoft.com/office/word/2024/wordml/sdtformatlock" xmlns:w16se="http://schemas.microsoft.com/office/word/2015/wordml/symex" xmlns:wpg="http://schemas.microsoft.com/office/word/2010/wordprocessingGroup" xmlns:wpi="http://schemas.microsoft.com/office/word/2010/wordprocessingInk" xmlns:wne="http://schemas.microsoft.com/office/word/2006/wordml" xmlns:wps="http://schemas.microsoft.com/office/word/2010/wordprocessingShape" mc:Ignorable="w14 w15 w16se w16cid w16 w16cex w16sdtdh w16sdtfl w16du wp14">
   <w:body>
-    <w:p>
-      <w:r>
-        <w:t xml:space="preserve">SLIDE </w:t>
-      </w:r>
-      <w:r>
-        <w:t>2</w:t>
-      </w:r>
-    </w:p>
     <w:p>
       <w:pPr>
         <w:rPr>
@@ -21,519 +13,6 @@
           <w:szCs w:val="40"/>
         </w:rPr>
       </w:pPr>
-      <w:r>
-        <w:rPr>
-          <w:rFonts w:ascii="Tahoma" w:hAnsi="Tahoma" w:cs="Tahoma"/>
-          <w:b/>
-          <w:bCs/>
-          <w:color w:val="7030A0"/>
-          <w:sz w:val="40"/>
-          <w:szCs w:val="40"/>
-        </w:rPr>
-        <w:t>SLIDE 3</w:t>
-      </w:r>
-    </w:p>
-    <w:p>
-      <w:pPr>
-        <w:rPr>
-          <w:b/>
-          <w:bCs/>
-        </w:rPr>
-      </w:pPr>
-      <w:r>
-        <w:rPr>
-          <w:b/>
-          <w:bCs/>
-        </w:rPr>
-        <w:t>1. Trust &amp; Quality Control</w:t>
-      </w:r>
-    </w:p>
-    <w:p>
-      <w:pPr>
-        <w:numPr>
-          <w:ilvl w:val="0"/>
-          <w:numId w:val="1"/>
-        </w:numPr>
-        <w:spacing w:after="0" w:line="240" w:lineRule="auto"/>
-      </w:pPr>
-      <w:proofErr w:type="gramStart"/>
-      <w:r>
-        <w:rPr>
-          <w:b/>
-          <w:bCs/>
-        </w:rPr>
-        <w:t>C</w:t>
-      </w:r>
-      <w:r>
-        <w:rPr>
-          <w:b/>
-          <w:bCs/>
-        </w:rPr>
-        <w:t>orrectness</w:t>
-      </w:r>
-      <w:proofErr w:type="gramEnd"/>
-      <w:r>
-        <w:rPr>
-          <w:b/>
-          <w:bCs/>
-        </w:rPr>
-        <w:t xml:space="preserve"> Anxiety:</w:t>
-      </w:r>
-      <w:r>
-        <w:t> "How do I know the AI isn't introducing subtle bugs I won't catch?"</w:t>
-      </w:r>
-    </w:p>
-    <w:p>
-      <w:pPr>
-        <w:numPr>
-          <w:ilvl w:val="0"/>
-          <w:numId w:val="1"/>
-        </w:numPr>
-        <w:spacing w:after="0" w:line="240" w:lineRule="auto"/>
-      </w:pPr>
-      <w:r>
-        <w:rPr>
-          <w:b/>
-          <w:bCs/>
-        </w:rPr>
-        <w:t>Testing Responsibility Shift:</w:t>
-      </w:r>
-      <w:r>
-        <w:t> "If AI writes code, who's responsible when it fails in production?"</w:t>
-      </w:r>
-    </w:p>
-    <w:p>
-      <w:pPr>
-        <w:numPr>
-          <w:ilvl w:val="0"/>
-          <w:numId w:val="1"/>
-        </w:numPr>
-        <w:spacing w:after="0" w:line="240" w:lineRule="auto"/>
-      </w:pPr>
-      <w:r>
-        <w:rPr>
-          <w:b/>
-          <w:bCs/>
-        </w:rPr>
-        <w:t>Code Review Overhead:</w:t>
-      </w:r>
-      <w:r>
-        <w:t xml:space="preserve"> "Reviewing AI code takes longer than writing it myself because I have to verify every </w:t>
-      </w:r>
-      <w:r>
-        <w:t>assumption.”</w:t>
-      </w:r>
-    </w:p>
-    <w:p>
-      <w:pPr>
-        <w:numPr>
-          <w:ilvl w:val="0"/>
-          <w:numId w:val="1"/>
-        </w:numPr>
-        <w:spacing w:after="0" w:line="240" w:lineRule="auto"/>
-      </w:pPr>
-      <w:r>
-        <w:rPr>
-          <w:b/>
-          <w:bCs/>
-        </w:rPr>
-        <w:t>Hallucination Risk:</w:t>
-      </w:r>
-      <w:r>
-        <w:t xml:space="preserve"> AI confidently generates </w:t>
-      </w:r>
-      <w:proofErr w:type="gramStart"/>
-      <w:r>
-        <w:t>plausible-looking</w:t>
-      </w:r>
-      <w:proofErr w:type="gramEnd"/>
-      <w:r>
-        <w:t xml:space="preserve"> but incorrect code (e.g., using deprecated APIs, wrong framework versions)</w:t>
-      </w:r>
-    </w:p>
-    <w:p>
-      <w:pPr>
-        <w:numPr>
-          <w:ilvl w:val="0"/>
-          <w:numId w:val="1"/>
-        </w:numPr>
-        <w:spacing w:after="0" w:line="240" w:lineRule="auto"/>
-      </w:pPr>
-      <w:r>
-        <w:rPr>
-          <w:b/>
-          <w:bCs/>
-        </w:rPr>
-        <w:t>Context Blindness:</w:t>
-      </w:r>
-      <w:r>
-        <w:t> AI doesn't understand business logic, domain-specific constraints, or edge cases unique to the project</w:t>
-      </w:r>
-    </w:p>
-    <w:p>
-      <w:pPr>
-        <w:numPr>
-          <w:ilvl w:val="0"/>
-          <w:numId w:val="1"/>
-        </w:numPr>
-        <w:spacing w:after="0" w:line="240" w:lineRule="auto"/>
-      </w:pPr>
-      <w:r>
-        <w:rPr>
-          <w:b/>
-          <w:bCs/>
-        </w:rPr>
-        <w:t>Technical Debt Accumulation:</w:t>
-      </w:r>
-      <w:r>
-        <w:t> "Will AI suggestions lead to shortcuts that create maintenance nightmares?"</w:t>
-      </w:r>
-    </w:p>
-    <w:p>
-      <w:pPr>
-        <w:numPr>
-          <w:ilvl w:val="0"/>
-          <w:numId w:val="1"/>
-        </w:numPr>
-        <w:spacing w:after="0" w:line="240" w:lineRule="auto"/>
-      </w:pPr>
-      <w:r>
-        <w:rPr>
-          <w:b/>
-          <w:bCs/>
-        </w:rPr>
-        <w:t>Loss of Code Ownership:</w:t>
-      </w:r>
-      <w:r>
-        <w:t xml:space="preserve"> "I can't explain code I didn't </w:t>
-      </w:r>
-      <w:r>
-        <w:t>‘write’—accountability</w:t>
-      </w:r>
-      <w:r>
-        <w:t xml:space="preserve"> becomes murky</w:t>
-      </w:r>
-    </w:p>
-    <w:p>
-      <w:pPr>
-        <w:spacing w:after="0" w:line="240" w:lineRule="auto"/>
-        <w:ind w:left="720"/>
-      </w:pPr>
-    </w:p>
-    <w:p>
-      <w:pPr>
-        <w:rPr>
-          <w:b/>
-          <w:bCs/>
-        </w:rPr>
-      </w:pPr>
-      <w:r>
-        <w:rPr>
-          <w:b/>
-          <w:bCs/>
-        </w:rPr>
-        <w:t>2. Learning Inhibitions</w:t>
-      </w:r>
-    </w:p>
-    <w:p>
-      <w:r>
-        <w:rPr>
-          <w:b/>
-          <w:bCs/>
-        </w:rPr>
-        <w:t>Core Concerns:</w:t>
-      </w:r>
-    </w:p>
-    <w:p>
-      <w:pPr>
-        <w:numPr>
-          <w:ilvl w:val="0"/>
-          <w:numId w:val="3"/>
-        </w:numPr>
-        <w:spacing w:after="0" w:line="240" w:lineRule="auto"/>
-      </w:pPr>
-      <w:r>
-        <w:rPr>
-          <w:b/>
-          <w:bCs/>
-        </w:rPr>
-        <w:t>Skill Atrophy:</w:t>
-      </w:r>
-      <w:r>
-        <w:t xml:space="preserve"> "If AI writes boilerplate, will junior </w:t>
-      </w:r>
-      <w:r>
-        <w:t>developers</w:t>
-      </w:r>
-      <w:r>
-        <w:t xml:space="preserve"> never learn fundamentals?"</w:t>
-      </w:r>
-    </w:p>
-    <w:p>
-      <w:pPr>
-        <w:numPr>
-          <w:ilvl w:val="0"/>
-          <w:numId w:val="3"/>
-        </w:numPr>
-        <w:spacing w:after="0" w:line="240" w:lineRule="auto"/>
-      </w:pPr>
-      <w:r>
-        <w:rPr>
-          <w:b/>
-          <w:bCs/>
-        </w:rPr>
-        <w:t>Dependency Formation:</w:t>
-      </w:r>
-      <w:r>
-        <w:t> "Will I become unable to code without AI assistance?"</w:t>
-      </w:r>
-    </w:p>
-    <w:p>
-      <w:pPr>
-        <w:numPr>
-          <w:ilvl w:val="0"/>
-          <w:numId w:val="3"/>
-        </w:numPr>
-        <w:spacing w:after="0" w:line="240" w:lineRule="auto"/>
-      </w:pPr>
-      <w:r>
-        <w:rPr>
-          <w:b/>
-          <w:bCs/>
-        </w:rPr>
-        <w:t>Mentorship Disruption:</w:t>
-      </w:r>
-      <w:r>
-        <w:t> "How do I teach juniors when they're just accepting AI suggestions?"</w:t>
-      </w:r>
-    </w:p>
-    <w:p>
-      <w:pPr>
-        <w:numPr>
-          <w:ilvl w:val="0"/>
-          <w:numId w:val="3"/>
-        </w:numPr>
-        <w:spacing w:after="0" w:line="240" w:lineRule="auto"/>
-      </w:pPr>
-      <w:r>
-        <w:rPr>
-          <w:b/>
-          <w:bCs/>
-        </w:rPr>
-        <w:t>Knowledge Gap Widening:</w:t>
-      </w:r>
-      <w:r>
-        <w:t xml:space="preserve"> "Senior </w:t>
-      </w:r>
-      <w:proofErr w:type="spellStart"/>
-      <w:r>
-        <w:t>devs</w:t>
-      </w:r>
-      <w:proofErr w:type="spellEnd"/>
-      <w:r>
-        <w:t xml:space="preserve"> gain velocity, juniors gain dependency - team cohesion </w:t>
-      </w:r>
-      <w:r>
-        <w:t>suffers.”</w:t>
-      </w:r>
-    </w:p>
-    <w:p>
-      <w:pPr>
-        <w:rPr>
-          <w:b/>
-          <w:bCs/>
-        </w:rPr>
-      </w:pPr>
-    </w:p>
-    <w:p>
-      <w:pPr>
-        <w:rPr>
-          <w:b/>
-          <w:bCs/>
-        </w:rPr>
-      </w:pPr>
-      <w:r>
-        <w:rPr>
-          <w:b/>
-          <w:bCs/>
-        </w:rPr>
-        <w:t>3. Security &amp; Intellectual Property Concerns</w:t>
-      </w:r>
-    </w:p>
-    <w:p>
-      <w:pPr>
-        <w:numPr>
-          <w:ilvl w:val="0"/>
-          <w:numId w:val="5"/>
-        </w:numPr>
-        <w:spacing w:after="0" w:line="240" w:lineRule="auto"/>
-      </w:pPr>
-      <w:r>
-        <w:rPr>
-          <w:b/>
-          <w:bCs/>
-        </w:rPr>
-        <w:t>Data Exfiltration:</w:t>
-      </w:r>
-      <w:r>
-        <w:t> "Is my proprietary code being sent to cloud servers for training?"</w:t>
-      </w:r>
-    </w:p>
-    <w:p>
-      <w:pPr>
-        <w:numPr>
-          <w:ilvl w:val="0"/>
-          <w:numId w:val="5"/>
-        </w:numPr>
-        <w:spacing w:after="0" w:line="240" w:lineRule="auto"/>
-      </w:pPr>
-      <w:r>
-        <w:rPr>
-          <w:b/>
-          <w:bCs/>
-        </w:rPr>
-        <w:t>License Contamination:</w:t>
-      </w:r>
-      <w:r>
-        <w:t> "Could AI suggest GPL-licensed code in my proprietary codebase?"</w:t>
-      </w:r>
-    </w:p>
-    <w:p>
-      <w:pPr>
-        <w:numPr>
-          <w:ilvl w:val="0"/>
-          <w:numId w:val="5"/>
-        </w:numPr>
-        <w:spacing w:after="0" w:line="240" w:lineRule="auto"/>
-      </w:pPr>
-      <w:r>
-        <w:rPr>
-          <w:b/>
-          <w:bCs/>
-        </w:rPr>
-        <w:t>Competitive Intelligence Leak:</w:t>
-      </w:r>
-      <w:r>
-        <w:t> "Are my company's patterns being exposed to competitors via shared AI?"</w:t>
-      </w:r>
-    </w:p>
-    <w:p>
-      <w:pPr>
-        <w:numPr>
-          <w:ilvl w:val="0"/>
-          <w:numId w:val="5"/>
-        </w:numPr>
-        <w:spacing w:after="0" w:line="240" w:lineRule="auto"/>
-      </w:pPr>
-      <w:r>
-        <w:rPr>
-          <w:b/>
-          <w:bCs/>
-        </w:rPr>
-        <w:t>Compliance Violations:</w:t>
-      </w:r>
-      <w:r>
-        <w:t> GDPR, HIPAA, SOC2 compliance requirements conflict with cloud-based AI</w:t>
-      </w:r>
-    </w:p>
-    <w:p>
-      <w:pPr>
-        <w:numPr>
-          <w:ilvl w:val="0"/>
-          <w:numId w:val="5"/>
-        </w:numPr>
-        <w:spacing w:after="0" w:line="240" w:lineRule="auto"/>
-      </w:pPr>
-      <w:r>
-        <w:rPr>
-          <w:b/>
-          <w:bCs/>
-        </w:rPr>
-        <w:lastRenderedPageBreak/>
-        <w:t>Trade Secret Exposure:</w:t>
-      </w:r>
-      <w:r>
-        <w:t> Algorithm implementations, business logic, customer data structures</w:t>
-      </w:r>
-    </w:p>
-    <w:p>
-      <w:r>
-        <w:rPr>
-          <w:b/>
-          <w:bCs/>
-        </w:rPr>
-        <w:t>Cultural &amp; Social Resistance:</w:t>
-      </w:r>
-    </w:p>
-    <w:p>
-      <w:pPr>
-        <w:numPr>
-          <w:ilvl w:val="0"/>
-          <w:numId w:val="8"/>
-        </w:numPr>
-        <w:spacing w:after="0" w:line="240" w:lineRule="auto"/>
-      </w:pPr>
-      <w:r>
-        <w:rPr>
-          <w:b/>
-          <w:bCs/>
-        </w:rPr>
-        <w:t>Craftsperson Identity:</w:t>
-      </w:r>
-      <w:r>
-        <w:t xml:space="preserve"> "I'm an </w:t>
-      </w:r>
-      <w:r>
-        <w:t>artist</w:t>
-      </w:r>
-      <w:r>
-        <w:t>, not an assembly line worker"</w:t>
-      </w:r>
-    </w:p>
-    <w:p>
-      <w:pPr>
-        <w:numPr>
-          <w:ilvl w:val="0"/>
-          <w:numId w:val="8"/>
-        </w:numPr>
-        <w:spacing w:after="0" w:line="240" w:lineRule="auto"/>
-      </w:pPr>
-      <w:r>
-        <w:rPr>
-          <w:b/>
-          <w:bCs/>
-        </w:rPr>
-        <w:t>Pride in Mastery:</w:t>
-      </w:r>
-      <w:r>
-        <w:t> "Using AI feels like cheating"</w:t>
-      </w:r>
-    </w:p>
-    <w:p>
-      <w:pPr>
-        <w:numPr>
-          <w:ilvl w:val="0"/>
-          <w:numId w:val="8"/>
-        </w:numPr>
-        <w:spacing w:after="0" w:line="240" w:lineRule="auto"/>
-      </w:pPr>
-      <w:r>
-        <w:rPr>
-          <w:b/>
-          <w:bCs/>
-        </w:rPr>
-        <w:t>Peer Pressure:</w:t>
-      </w:r>
-      <w:r>
-        <w:t xml:space="preserve"> "AI assistance </w:t>
-      </w:r>
-      <w:r>
-        <w:t>feels like a skillset weakness.”</w:t>
-      </w:r>
-    </w:p>
-    <w:p/>
-    <w:p/>
-    <w:p>
       <w:r>
         <w:rPr>
           <w:rFonts w:ascii="Tahoma" w:hAnsi="Tahoma" w:cs="Tahoma"/>
@@ -554,25 +33,25 @@
           <w:sz w:val="40"/>
           <w:szCs w:val="40"/>
         </w:rPr>
-        <w:t>6</w:t>
-      </w:r>
-    </w:p>
-    <w:p>
-      <w:r>
-        <w:t>When we type a request into VS Code with GitHub Copilot and hit enter, the extension first takes our input and breaks it down into tokens. Tokens are essentially small chunks of text—these could be entire words or parts of words, depending on how the language model works. For example, a longer word might get split into multiple tokens, while simpler words might remain as single tokens.</w:t>
-      </w:r>
-    </w:p>
-    <w:p>
-      <w:r>
-        <w:t>Once our request is tokenized, those tokens, along with some context from the file we're working on (like surrounding code), are packaged up and sent over the network to Copilot’s servers. On the server side, the large language model hosted by Copilot takes these tokens and uses them to understand what we're asking. It runs the tokens through its neural network layers, which have been trained on a vast amount of code and natural language data, to generate a relevant response.</w:t>
-      </w:r>
-    </w:p>
-    <w:p>
-      <w:r>
-        <w:t>That response is then turned back into tokens on the server side. These response tokens are sent back over the network to our VS Code editor. Finally, our editor reassembles these tokens into the natural language or code completion we see on our screen.</w:t>
-      </w:r>
-    </w:p>
-    <w:p>
+        <w:t>2</w:t>
+      </w:r>
+    </w:p>
+    <w:p>
+      <w:r>
+        <w:t>Audience</w:t>
+      </w:r>
+    </w:p>
+    <w:p>
+      <w:pPr>
+        <w:rPr>
+          <w:rFonts w:ascii="Tahoma" w:hAnsi="Tahoma" w:cs="Tahoma"/>
+          <w:b/>
+          <w:bCs/>
+          <w:color w:val="7030A0"/>
+          <w:sz w:val="40"/>
+          <w:szCs w:val="40"/>
+        </w:rPr>
+      </w:pPr>
       <w:r>
         <w:rPr>
           <w:rFonts w:ascii="Tahoma" w:hAnsi="Tahoma" w:cs="Tahoma"/>
@@ -593,20 +72,483 @@
           <w:sz w:val="40"/>
           <w:szCs w:val="40"/>
         </w:rPr>
-        <w:t>7</w:t>
-      </w:r>
-    </w:p>
-    <w:p>
-      <w:r>
-        <w:t>In a nutshell, our request is tokenized locally, sent to the server, processed by the model, and then the response comes back as tokens that are turned into the</w:t>
-      </w:r>
-      <w:r>
-        <w:t xml:space="preserve"> conversations and code</w:t>
-      </w:r>
-      <w:r>
-        <w:t xml:space="preserve"> completion we see. </w:t>
-      </w:r>
-    </w:p>
+        <w:t>4</w:t>
+      </w:r>
+    </w:p>
+    <w:p>
+      <w:pPr>
+        <w:rPr>
+          <w:b/>
+          <w:bCs/>
+        </w:rPr>
+      </w:pPr>
+      <w:r>
+        <w:rPr>
+          <w:b/>
+          <w:bCs/>
+        </w:rPr>
+        <w:t>1. Trust &amp; Quality Control</w:t>
+      </w:r>
+    </w:p>
+    <w:p>
+      <w:pPr>
+        <w:numPr>
+          <w:ilvl w:val="0"/>
+          <w:numId w:val="1"/>
+        </w:numPr>
+        <w:spacing w:after="0" w:line="240" w:lineRule="auto"/>
+      </w:pPr>
+      <w:r>
+        <w:rPr>
+          <w:b/>
+          <w:bCs/>
+        </w:rPr>
+        <w:t>C</w:t>
+      </w:r>
+      <w:r>
+        <w:rPr>
+          <w:b/>
+          <w:bCs/>
+        </w:rPr>
+        <w:t>orrectness Anxiety:</w:t>
+      </w:r>
+      <w:r>
+        <w:t> "How do I know the AI isn't introducing subtle bugs I won't catch?"</w:t>
+      </w:r>
+    </w:p>
+    <w:p>
+      <w:pPr>
+        <w:numPr>
+          <w:ilvl w:val="0"/>
+          <w:numId w:val="1"/>
+        </w:numPr>
+        <w:spacing w:after="0" w:line="240" w:lineRule="auto"/>
+      </w:pPr>
+      <w:r>
+        <w:rPr>
+          <w:b/>
+          <w:bCs/>
+        </w:rPr>
+        <w:t>Testing Responsibility Shift:</w:t>
+      </w:r>
+      <w:r>
+        <w:t> "If AI writes code, who's responsible when it fails in production?"</w:t>
+      </w:r>
+    </w:p>
+    <w:p>
+      <w:pPr>
+        <w:numPr>
+          <w:ilvl w:val="0"/>
+          <w:numId w:val="1"/>
+        </w:numPr>
+        <w:spacing w:after="0" w:line="240" w:lineRule="auto"/>
+      </w:pPr>
+      <w:r>
+        <w:rPr>
+          <w:b/>
+          <w:bCs/>
+        </w:rPr>
+        <w:t>Code Review Overhead:</w:t>
+      </w:r>
+      <w:r>
+        <w:t xml:space="preserve"> "Reviewing AI code takes longer than writing it myself because I have to verify every </w:t>
+      </w:r>
+      <w:r>
+        <w:t>assumption.”</w:t>
+      </w:r>
+    </w:p>
+    <w:p>
+      <w:pPr>
+        <w:numPr>
+          <w:ilvl w:val="0"/>
+          <w:numId w:val="1"/>
+        </w:numPr>
+        <w:spacing w:after="0" w:line="240" w:lineRule="auto"/>
+      </w:pPr>
+      <w:r>
+        <w:rPr>
+          <w:b/>
+          <w:bCs/>
+        </w:rPr>
+        <w:t>Hallucination Risk:</w:t>
+      </w:r>
+      <w:r>
+        <w:t> AI confidently generates plausible-looking but incorrect code (e.g., using deprecated APIs, wrong framework versions)</w:t>
+      </w:r>
+    </w:p>
+    <w:p>
+      <w:pPr>
+        <w:numPr>
+          <w:ilvl w:val="0"/>
+          <w:numId w:val="1"/>
+        </w:numPr>
+        <w:spacing w:after="0" w:line="240" w:lineRule="auto"/>
+      </w:pPr>
+      <w:r>
+        <w:rPr>
+          <w:b/>
+          <w:bCs/>
+        </w:rPr>
+        <w:t>Context Blindness:</w:t>
+      </w:r>
+      <w:r>
+        <w:t> AI doesn't understand business logic, domain-specific constraints, or edge cases unique to the project</w:t>
+      </w:r>
+    </w:p>
+    <w:p>
+      <w:pPr>
+        <w:numPr>
+          <w:ilvl w:val="0"/>
+          <w:numId w:val="1"/>
+        </w:numPr>
+        <w:spacing w:after="0" w:line="240" w:lineRule="auto"/>
+      </w:pPr>
+      <w:r>
+        <w:rPr>
+          <w:b/>
+          <w:bCs/>
+        </w:rPr>
+        <w:t>Technical Debt Accumulation:</w:t>
+      </w:r>
+      <w:r>
+        <w:t> "Will AI suggestions lead to shortcuts that create maintenance nightmares?"</w:t>
+      </w:r>
+    </w:p>
+    <w:p>
+      <w:pPr>
+        <w:numPr>
+          <w:ilvl w:val="0"/>
+          <w:numId w:val="1"/>
+        </w:numPr>
+        <w:spacing w:after="0" w:line="240" w:lineRule="auto"/>
+      </w:pPr>
+      <w:r>
+        <w:rPr>
+          <w:b/>
+          <w:bCs/>
+        </w:rPr>
+        <w:t>Loss of Code Ownership:</w:t>
+      </w:r>
+      <w:r>
+        <w:t xml:space="preserve"> "I can't explain code I didn't </w:t>
+      </w:r>
+      <w:r>
+        <w:t>‘write’—accountability</w:t>
+      </w:r>
+      <w:r>
+        <w:t xml:space="preserve"> becomes murky</w:t>
+      </w:r>
+    </w:p>
+    <w:p>
+      <w:pPr>
+        <w:spacing w:after="0" w:line="240" w:lineRule="auto"/>
+        <w:ind w:left="720"/>
+      </w:pPr>
+    </w:p>
+    <w:p>
+      <w:pPr>
+        <w:rPr>
+          <w:b/>
+          <w:bCs/>
+        </w:rPr>
+      </w:pPr>
+      <w:r>
+        <w:rPr>
+          <w:b/>
+          <w:bCs/>
+        </w:rPr>
+        <w:t>2. Learning Inhibitions</w:t>
+      </w:r>
+    </w:p>
+    <w:p>
+      <w:r>
+        <w:rPr>
+          <w:b/>
+          <w:bCs/>
+        </w:rPr>
+        <w:t>Core Concerns:</w:t>
+      </w:r>
+    </w:p>
+    <w:p>
+      <w:pPr>
+        <w:numPr>
+          <w:ilvl w:val="0"/>
+          <w:numId w:val="3"/>
+        </w:numPr>
+        <w:spacing w:after="0" w:line="240" w:lineRule="auto"/>
+      </w:pPr>
+      <w:r>
+        <w:rPr>
+          <w:b/>
+          <w:bCs/>
+        </w:rPr>
+        <w:t>Skill Atrophy:</w:t>
+      </w:r>
+      <w:r>
+        <w:t xml:space="preserve"> "If AI writes boilerplate, will junior </w:t>
+      </w:r>
+      <w:r>
+        <w:t>developers</w:t>
+      </w:r>
+      <w:r>
+        <w:t xml:space="preserve"> never learn fundamentals?"</w:t>
+      </w:r>
+    </w:p>
+    <w:p>
+      <w:pPr>
+        <w:numPr>
+          <w:ilvl w:val="0"/>
+          <w:numId w:val="3"/>
+        </w:numPr>
+        <w:spacing w:after="0" w:line="240" w:lineRule="auto"/>
+      </w:pPr>
+      <w:r>
+        <w:rPr>
+          <w:b/>
+          <w:bCs/>
+        </w:rPr>
+        <w:t>Dependency Formation:</w:t>
+      </w:r>
+      <w:r>
+        <w:t> "Will I become unable to code without AI assistance?"</w:t>
+      </w:r>
+    </w:p>
+    <w:p>
+      <w:pPr>
+        <w:numPr>
+          <w:ilvl w:val="0"/>
+          <w:numId w:val="3"/>
+        </w:numPr>
+        <w:spacing w:after="0" w:line="240" w:lineRule="auto"/>
+      </w:pPr>
+      <w:r>
+        <w:rPr>
+          <w:b/>
+          <w:bCs/>
+        </w:rPr>
+        <w:t>Mentorship Disruption:</w:t>
+      </w:r>
+      <w:r>
+        <w:t> "How do I teach juniors when they're just accepting AI suggestions?"</w:t>
+      </w:r>
+    </w:p>
+    <w:p>
+      <w:pPr>
+        <w:numPr>
+          <w:ilvl w:val="0"/>
+          <w:numId w:val="3"/>
+        </w:numPr>
+        <w:spacing w:after="0" w:line="240" w:lineRule="auto"/>
+      </w:pPr>
+      <w:r>
+        <w:rPr>
+          <w:b/>
+          <w:bCs/>
+        </w:rPr>
+        <w:t>Knowledge Gap Widening:</w:t>
+      </w:r>
+      <w:r>
+        <w:t xml:space="preserve"> "Senior devs gain velocity, juniors gain dependency - team cohesion </w:t>
+      </w:r>
+      <w:r>
+        <w:t>suffers.”</w:t>
+      </w:r>
+    </w:p>
+    <w:p>
+      <w:pPr>
+        <w:rPr>
+          <w:b/>
+          <w:bCs/>
+        </w:rPr>
+      </w:pPr>
+    </w:p>
+    <w:p>
+      <w:pPr>
+        <w:rPr>
+          <w:b/>
+          <w:bCs/>
+        </w:rPr>
+      </w:pPr>
+      <w:r>
+        <w:rPr>
+          <w:b/>
+          <w:bCs/>
+        </w:rPr>
+        <w:t>3. Security &amp; Intellectual Property Concerns</w:t>
+      </w:r>
+    </w:p>
+    <w:p>
+      <w:pPr>
+        <w:numPr>
+          <w:ilvl w:val="0"/>
+          <w:numId w:val="5"/>
+        </w:numPr>
+        <w:spacing w:after="0" w:line="240" w:lineRule="auto"/>
+      </w:pPr>
+      <w:r>
+        <w:rPr>
+          <w:b/>
+          <w:bCs/>
+        </w:rPr>
+        <w:t>Data Exfiltration:</w:t>
+      </w:r>
+      <w:r>
+        <w:t> "Is my proprietary code being sent to cloud servers for training?"</w:t>
+      </w:r>
+    </w:p>
+    <w:p>
+      <w:pPr>
+        <w:numPr>
+          <w:ilvl w:val="0"/>
+          <w:numId w:val="5"/>
+        </w:numPr>
+        <w:spacing w:after="0" w:line="240" w:lineRule="auto"/>
+      </w:pPr>
+      <w:r>
+        <w:rPr>
+          <w:b/>
+          <w:bCs/>
+        </w:rPr>
+        <w:t>License Contamination:</w:t>
+      </w:r>
+      <w:r>
+        <w:t> "Could AI suggest GPL-licensed code in my proprietary codebase?"</w:t>
+      </w:r>
+    </w:p>
+    <w:p>
+      <w:pPr>
+        <w:numPr>
+          <w:ilvl w:val="0"/>
+          <w:numId w:val="5"/>
+        </w:numPr>
+        <w:spacing w:after="0" w:line="240" w:lineRule="auto"/>
+      </w:pPr>
+      <w:r>
+        <w:rPr>
+          <w:b/>
+          <w:bCs/>
+        </w:rPr>
+        <w:t>Competitive Intelligence Leak:</w:t>
+      </w:r>
+      <w:r>
+        <w:t> "Are my company's patterns being exposed to competitors via shared AI?"</w:t>
+      </w:r>
+    </w:p>
+    <w:p>
+      <w:pPr>
+        <w:numPr>
+          <w:ilvl w:val="0"/>
+          <w:numId w:val="5"/>
+        </w:numPr>
+        <w:spacing w:after="0" w:line="240" w:lineRule="auto"/>
+      </w:pPr>
+      <w:r>
+        <w:rPr>
+          <w:b/>
+          <w:bCs/>
+        </w:rPr>
+        <w:lastRenderedPageBreak/>
+        <w:t>Compliance Violations:</w:t>
+      </w:r>
+      <w:r>
+        <w:t> GDPR, HIPAA, SOC2 compliance requirements conflict with cloud-based AI</w:t>
+      </w:r>
+    </w:p>
+    <w:p>
+      <w:pPr>
+        <w:numPr>
+          <w:ilvl w:val="0"/>
+          <w:numId w:val="5"/>
+        </w:numPr>
+        <w:spacing w:after="0" w:line="240" w:lineRule="auto"/>
+      </w:pPr>
+      <w:r>
+        <w:rPr>
+          <w:b/>
+          <w:bCs/>
+        </w:rPr>
+        <w:t>Trade Secret Exposure:</w:t>
+      </w:r>
+      <w:r>
+        <w:t> Algorithm implementations, business logic, customer data structures</w:t>
+      </w:r>
+    </w:p>
+    <w:p>
+      <w:r>
+        <w:rPr>
+          <w:b/>
+          <w:bCs/>
+        </w:rPr>
+        <w:t>Cultural &amp; Social Resistance:</w:t>
+      </w:r>
+    </w:p>
+    <w:p>
+      <w:pPr>
+        <w:numPr>
+          <w:ilvl w:val="0"/>
+          <w:numId w:val="8"/>
+        </w:numPr>
+        <w:spacing w:after="0" w:line="240" w:lineRule="auto"/>
+      </w:pPr>
+      <w:r>
+        <w:rPr>
+          <w:b/>
+          <w:bCs/>
+        </w:rPr>
+        <w:t>Craftsperson Identity:</w:t>
+      </w:r>
+      <w:r>
+        <w:t xml:space="preserve"> "I'm an </w:t>
+      </w:r>
+      <w:r>
+        <w:t>artist</w:t>
+      </w:r>
+      <w:r>
+        <w:t>, not an assembly line worker"</w:t>
+      </w:r>
+    </w:p>
+    <w:p>
+      <w:pPr>
+        <w:numPr>
+          <w:ilvl w:val="0"/>
+          <w:numId w:val="8"/>
+        </w:numPr>
+        <w:spacing w:after="0" w:line="240" w:lineRule="auto"/>
+      </w:pPr>
+      <w:r>
+        <w:rPr>
+          <w:b/>
+          <w:bCs/>
+        </w:rPr>
+        <w:t>Pride in Mastery:</w:t>
+      </w:r>
+      <w:r>
+        <w:t> "Using AI feels like cheating"</w:t>
+      </w:r>
+    </w:p>
+    <w:p>
+      <w:pPr>
+        <w:numPr>
+          <w:ilvl w:val="0"/>
+          <w:numId w:val="8"/>
+        </w:numPr>
+        <w:spacing w:after="0" w:line="240" w:lineRule="auto"/>
+      </w:pPr>
+      <w:r>
+        <w:rPr>
+          <w:b/>
+          <w:bCs/>
+        </w:rPr>
+        <w:t>Peer Pressure:</w:t>
+      </w:r>
+      <w:r>
+        <w:t xml:space="preserve"> "AI assistance </w:t>
+      </w:r>
+      <w:r>
+        <w:t>feels like a skillset weakness.”</w:t>
+      </w:r>
+    </w:p>
+    <w:p/>
     <w:p>
       <w:r>
         <w:rPr>
@@ -628,14 +570,499 @@
           <w:sz w:val="40"/>
           <w:szCs w:val="40"/>
         </w:rPr>
-        <w:t>8</w:t>
-      </w:r>
-    </w:p>
-    <w:p>
-      <w:r>
+        <w:t>6</w:t>
+      </w:r>
+    </w:p>
+    <w:p>
+      <w:r>
+        <w:t>When we type a request into VS Code with GitHub Copilot and hit enter, the extension first takes our input and breaks it down into tokens. Tokens are essentially small chunks of text—these could be entire words or parts of words, depending on how the language model works. For example, a longer word might get split into multiple tokens, while simpler words might remain as single tokens.</w:t>
+      </w:r>
+    </w:p>
+    <w:p>
+      <w:r>
+        <w:t>Once our request is tokenized, those tokens, along with some context from the file we're working on (like surrounding code), are packaged up and sent over the network to Copilot’s servers. On the server side, the large language model hosted by Copilot takes these tokens and uses them to understand what we're asking. It runs the tokens through its neural network layers, which have been trained on a vast amount of code and natural language data, to generate a relevant response.</w:t>
+      </w:r>
+    </w:p>
+    <w:p>
+      <w:r>
+        <w:t>That response is then turned back into tokens on the server side. These response tokens are sent back over the network to our VS Code editor. Finally, our editor reassembles these tokens into the natural language or code completion we see on our screen.</w:t>
+      </w:r>
+    </w:p>
+    <w:p>
+      <w:r>
+        <w:rPr>
+          <w:rFonts w:ascii="Tahoma" w:hAnsi="Tahoma" w:cs="Tahoma"/>
+          <w:b/>
+          <w:bCs/>
+          <w:color w:val="7030A0"/>
+          <w:sz w:val="40"/>
+          <w:szCs w:val="40"/>
+        </w:rPr>
+        <w:t xml:space="preserve">SLIDE </w:t>
+      </w:r>
+      <w:r>
+        <w:rPr>
+          <w:rFonts w:ascii="Tahoma" w:hAnsi="Tahoma" w:cs="Tahoma"/>
+          <w:b/>
+          <w:bCs/>
+          <w:color w:val="7030A0"/>
+          <w:sz w:val="40"/>
+          <w:szCs w:val="40"/>
+        </w:rPr>
+        <w:t>7</w:t>
+      </w:r>
+    </w:p>
+    <w:p>
+      <w:r>
+        <w:t>In a nutshell, our request is tokenized locally, sent to the server, processed by the model, and then the response comes back as tokens that are turned into the</w:t>
+      </w:r>
+      <w:r>
+        <w:t xml:space="preserve"> conversations and code</w:t>
+      </w:r>
+      <w:r>
+        <w:t xml:space="preserve"> completion we see. </w:t>
+      </w:r>
+    </w:p>
+    <w:p>
+      <w:pPr>
+        <w:rPr>
+          <w:rFonts w:ascii="Tahoma" w:hAnsi="Tahoma" w:cs="Tahoma"/>
+          <w:b/>
+          <w:bCs/>
+          <w:color w:val="7030A0"/>
+          <w:sz w:val="40"/>
+          <w:szCs w:val="40"/>
+        </w:rPr>
+      </w:pPr>
+    </w:p>
+    <w:p>
+      <w:pPr>
+        <w:rPr>
+          <w:rFonts w:ascii="Tahoma" w:hAnsi="Tahoma" w:cs="Tahoma"/>
+          <w:b/>
+          <w:bCs/>
+          <w:color w:val="7030A0"/>
+          <w:sz w:val="40"/>
+          <w:szCs w:val="40"/>
+        </w:rPr>
+      </w:pPr>
+      <w:r>
+        <w:rPr>
+          <w:rFonts w:ascii="Tahoma" w:hAnsi="Tahoma" w:cs="Tahoma"/>
+          <w:b/>
+          <w:bCs/>
+          <w:color w:val="7030A0"/>
+          <w:sz w:val="40"/>
+          <w:szCs w:val="40"/>
+        </w:rPr>
+        <w:br w:type="page"/>
+      </w:r>
+    </w:p>
+    <w:p>
+      <w:pPr>
+        <w:rPr>
+          <w:rFonts w:ascii="Tahoma" w:hAnsi="Tahoma" w:cs="Tahoma"/>
+          <w:b/>
+          <w:bCs/>
+          <w:color w:val="7030A0"/>
+          <w:sz w:val="40"/>
+          <w:szCs w:val="40"/>
+        </w:rPr>
+      </w:pPr>
+      <w:r>
+        <w:rPr>
+          <w:rFonts w:ascii="Tahoma" w:hAnsi="Tahoma" w:cs="Tahoma"/>
+          <w:b/>
+          <w:bCs/>
+          <w:color w:val="7030A0"/>
+          <w:sz w:val="40"/>
+          <w:szCs w:val="40"/>
+        </w:rPr>
+        <w:lastRenderedPageBreak/>
+        <w:t>SLIDE</w:t>
+      </w:r>
+      <w:r>
+        <w:rPr>
+          <w:rFonts w:ascii="Tahoma" w:hAnsi="Tahoma" w:cs="Tahoma"/>
+          <w:b/>
+          <w:bCs/>
+          <w:color w:val="7030A0"/>
+          <w:sz w:val="40"/>
+          <w:szCs w:val="40"/>
+        </w:rPr>
+        <w:t xml:space="preserve"> 9</w:t>
+      </w:r>
+    </w:p>
+    <w:p>
+      <w:r>
+        <w:t>What do I want from you</w:t>
+      </w:r>
+      <w:r>
+        <w:t xml:space="preserve"> during this presentation?</w:t>
+      </w:r>
+      <w:r>
+        <w:br/>
+        <w:t xml:space="preserve">I want you to </w:t>
+      </w:r>
+      <w:r>
+        <w:t>sit back</w:t>
+      </w:r>
+      <w:r>
+        <w:t>, relax,</w:t>
+      </w:r>
+      <w:r>
+        <w:t xml:space="preserve"> and take it all in</w:t>
+      </w:r>
+      <w:r>
+        <w:t xml:space="preserve"> like you’re watching a movie</w:t>
+      </w:r>
+      <w:r>
+        <w:t>. You’re not going to absorb every single thing, and that’s OK. That’s what the recording and transcription are for. You can return to the recording for a refresher as many times as needed.</w:t>
+      </w:r>
+      <w:r>
+        <w:br/>
+      </w:r>
+      <w:r>
+        <w:t>M</w:t>
+      </w:r>
+      <w:r>
+        <w:t xml:space="preserve">y </w:t>
+      </w:r>
+      <w:r>
+        <w:t>advice</w:t>
+      </w:r>
+      <w:r>
+        <w:t xml:space="preserve"> to you</w:t>
+      </w:r>
+      <w:r>
+        <w:t xml:space="preserve"> is, don’t focus</w:t>
+      </w:r>
+      <w:r>
+        <w:t xml:space="preserve"> on the mechanics of what I’m showing</w:t>
+      </w:r>
+      <w:r>
+        <w:t xml:space="preserve"> you. Instead, as I walk you through the demo, I want you to imagine what YOU can do with this in your respective areas and applications. </w:t>
+      </w:r>
+    </w:p>
+    <w:p>
+      <w:r>
+        <w:t xml:space="preserve">Let your imagination run free. If you can envision it, Copilot can </w:t>
+      </w:r>
+      <w:r>
+        <w:t>help you make</w:t>
+      </w:r>
+      <w:r>
+        <w:t xml:space="preserve"> it a reality. Think creatively and aim high! I’m not just enthusiastic about Copilot; I speak from personal experience</w:t>
+      </w:r>
+      <w:r>
+        <w:t xml:space="preserve">. What I’ve been able to accomplish, and the speed and quality with which I did it, is simply phenomenal. </w:t>
+      </w:r>
+    </w:p>
+    <w:p>
+      <w:r>
+        <w:br w:type="page"/>
+      </w:r>
+    </w:p>
+    <w:p>
+      <w:r>
+        <w:lastRenderedPageBreak/>
+        <w:br w:type="page"/>
+      </w:r>
+    </w:p>
+    <w:p>
+      <w:r>
+        <w:lastRenderedPageBreak/>
         <w:t>Inline</w:t>
       </w:r>
     </w:p>
+    <w:p>
+      <w:r>
+        <w:t>01 SETUP</w:t>
+      </w:r>
+    </w:p>
+    <w:p>
+      <w:r>
+        <w:t>02 Documentation of legacy CF application</w:t>
+      </w:r>
+    </w:p>
+    <w:p>
+      <w:r>
+        <w:t>03|04 How would you redesign?</w:t>
+      </w:r>
+    </w:p>
+    <w:p>
+      <w:r>
+        <w:t>05 @workspace continue with Data Access Layer document '</w:t>
+      </w:r>
+    </w:p>
+    <w:p>
+      <w:r>
+        <w:t>06 @workspace  can you tell me what we've been working on today?</w:t>
+      </w:r>
+    </w:p>
+    <w:p>
+      <w:r>
+        <w:t>07 review the repo and find the most complicated code and view</w:t>
+      </w:r>
+    </w:p>
+    <w:p>
+      <w:r>
+        <w:t>08 Redesign fusebox40.transformer</w:t>
+      </w:r>
+    </w:p>
+    <w:p>
+      <w:r>
+        <w:t>09 Memory test: Based on my original enhancement plan, what should I address next?</w:t>
+      </w:r>
+    </w:p>
+    <w:p>
+      <w:r>
+        <w:t>10 Complete redesign plan</w:t>
+      </w:r>
+    </w:p>
+    <w:p>
+      <w:r>
+        <w:t>11 Creating Tests</w:t>
+      </w:r>
+    </w:p>
+    <w:p>
+      <w:r>
+        <w:t>12 Diagram new architecture</w:t>
+      </w:r>
+    </w:p>
+    <w:p>
+      <w:r>
+        <w:br w:type="page"/>
+      </w:r>
+    </w:p>
+    <w:p>
+      <w:r>
+        <w:rPr>
+          <w:b/>
+          <w:bCs/>
+        </w:rPr>
+        <w:lastRenderedPageBreak/>
+        <w:t>AI Engineering Evangelist</w:t>
+      </w:r>
+      <w:r>
+        <w:t> </w:t>
+      </w:r>
+    </w:p>
+    <w:p>
+      <w:r>
+        <w:rPr>
+          <w:b/>
+          <w:bCs/>
+        </w:rPr>
+        <w:t>Key Responsibilities</w:t>
+      </w:r>
+      <w:r>
+        <w:t> </w:t>
+      </w:r>
+    </w:p>
+    <w:p>
+      <w:r>
+        <w:rPr>
+          <w:b/>
+          <w:bCs/>
+        </w:rPr>
+        <w:t>AI Adoption and Enablement</w:t>
+      </w:r>
+      <w:r>
+        <w:t> </w:t>
+      </w:r>
+    </w:p>
+    <w:p>
+      <w:pPr>
+        <w:numPr>
+          <w:ilvl w:val="0"/>
+          <w:numId w:val="9"/>
+        </w:numPr>
+      </w:pPr>
+      <w:r>
+        <w:t>Adoption of AI tools across Engineering, including GitHub Copilot, M365 Copilot, code assistants, test-generation tools, and AI-powered automation. </w:t>
+      </w:r>
+    </w:p>
+    <w:p>
+      <w:pPr>
+        <w:numPr>
+          <w:ilvl w:val="0"/>
+          <w:numId w:val="10"/>
+        </w:numPr>
+      </w:pPr>
+      <w:r>
+        <w:t>Develop a structured AI adoption roadmap—pilots, rollout, training, usage measurement, and continuous improvement. </w:t>
+      </w:r>
+    </w:p>
+    <w:p>
+      <w:pPr>
+        <w:numPr>
+          <w:ilvl w:val="0"/>
+          <w:numId w:val="11"/>
+        </w:numPr>
+      </w:pPr>
+      <w:r>
+        <w:t>Track Copilot usage metrics, dashboards, and telemetry; drive consistent usage across engineering teams with targeted interventions. </w:t>
+      </w:r>
+    </w:p>
+    <w:p>
+      <w:pPr>
+        <w:numPr>
+          <w:ilvl w:val="0"/>
+          <w:numId w:val="12"/>
+        </w:numPr>
+      </w:pPr>
+      <w:r>
+        <w:t>Partner with AI Innovation team, Security, Compliance, and Architecture to ensure safe, policy-aligned use of AI tools and LLMs. </w:t>
+      </w:r>
+    </w:p>
+    <w:p>
+      <w:r>
+        <w:t>AH: I think we should emphasize responsibility for “behavioral adoption”, not just tool rollout. Engineers need to change the paradigm of how they work, not just tool they use. </w:t>
+      </w:r>
+    </w:p>
+    <w:p>
+      <w:pPr>
+        <w:numPr>
+          <w:ilvl w:val="0"/>
+          <w:numId w:val="13"/>
+        </w:numPr>
+      </w:pPr>
+      <w:r>
+        <w:t> </w:t>
+      </w:r>
+    </w:p>
+    <w:p>
+      <w:r>
+        <w:rPr>
+          <w:b/>
+          <w:bCs/>
+        </w:rPr>
+        <w:t>Engineering Productivity</w:t>
+      </w:r>
+      <w:r>
+        <w:t> </w:t>
+      </w:r>
+    </w:p>
+    <w:p>
+      <w:pPr>
+        <w:numPr>
+          <w:ilvl w:val="0"/>
+          <w:numId w:val="14"/>
+        </w:numPr>
+      </w:pPr>
+      <w:r>
+        <w:t>Align, and operationalize Engineering Productivity KPIs distinguishing meaningful improvements from noise. </w:t>
+      </w:r>
+    </w:p>
+    <w:p>
+      <w:pPr>
+        <w:numPr>
+          <w:ilvl w:val="0"/>
+          <w:numId w:val="15"/>
+        </w:numPr>
+      </w:pPr>
+      <w:r>
+        <w:t>Build transparent productivity scorecards for teams and leaders, including trend analysis and actionable insights. </w:t>
+      </w:r>
+    </w:p>
+    <w:p>
+      <w:pPr>
+        <w:numPr>
+          <w:ilvl w:val="0"/>
+          <w:numId w:val="16"/>
+        </w:numPr>
+      </w:pPr>
+      <w:r>
+        <w:t>Add oversight of experimentation metrics, token efficiency, and model-selection guidance as part of the productivity narrative. Experimentation metrics are the numbers that tell whether an AI workflow, tool, or practice makes engineering better—not just louder, shinier. </w:t>
+      </w:r>
+    </w:p>
+    <w:p>
+      <w:r>
+        <w:rPr>
+          <w:b/>
+          <w:bCs/>
+        </w:rPr>
+        <w:t>Stakeholder Alignment &amp; Change Management</w:t>
+      </w:r>
+      <w:r>
+        <w:t> </w:t>
+      </w:r>
+    </w:p>
+    <w:p>
+      <w:pPr>
+        <w:numPr>
+          <w:ilvl w:val="0"/>
+          <w:numId w:val="17"/>
+        </w:numPr>
+      </w:pPr>
+      <w:r>
+        <w:t>Serve as the central connector between Engineering, Product, Design, PMO, Ops, Security, and Compliance to ensure aligned AI usage patterns. </w:t>
+      </w:r>
+    </w:p>
+    <w:p>
+      <w:pPr>
+        <w:numPr>
+          <w:ilvl w:val="0"/>
+          <w:numId w:val="18"/>
+        </w:numPr>
+      </w:pPr>
+      <w:r>
+        <w:t>Lead customized change management programs in the Engineering organization for training, communication, documentation, office hours—to increase trust and adoption. </w:t>
+      </w:r>
+    </w:p>
+    <w:p>
+      <w:pPr>
+        <w:numPr>
+          <w:ilvl w:val="0"/>
+          <w:numId w:val="19"/>
+        </w:numPr>
+      </w:pPr>
+      <w:r>
+        <w:lastRenderedPageBreak/>
+        <w:t>Report progress, insights, blockers, and opportunities directly to the Head of Engineering </w:t>
+      </w:r>
+    </w:p>
+    <w:p>
+      <w:r>
+        <w:rPr>
+          <w:b/>
+          <w:bCs/>
+        </w:rPr>
+        <w:t>Experimentation &amp; Innovation</w:t>
+      </w:r>
+      <w:r>
+        <w:t> </w:t>
+      </w:r>
+    </w:p>
+    <w:p>
+      <w:pPr>
+        <w:numPr>
+          <w:ilvl w:val="0"/>
+          <w:numId w:val="20"/>
+        </w:numPr>
+      </w:pPr>
+      <w:r>
+        <w:t>Build a continuous experimentation pipeline for new AI tools, frameworks, and workflows; evaluate ROI and recommend adoption. </w:t>
+      </w:r>
+    </w:p>
+    <w:p>
+      <w:pPr>
+        <w:numPr>
+          <w:ilvl w:val="0"/>
+          <w:numId w:val="21"/>
+        </w:numPr>
+      </w:pPr>
+      <w:r>
+        <w:t>Coach teams and leaders on AI-first development practices and how to integrate AI into day-to-day engineering. </w:t>
+      </w:r>
+    </w:p>
+    <w:p>
+      <w:r>
+        <w:t> </w:t>
+      </w:r>
+    </w:p>
+    <w:p/>
     <w:sectPr>
       <w:pgSz w:w="12240" w:h="15840"/>
       <w:pgMar w:top="1620" w:right="1440" w:bottom="1440" w:left="1440" w:header="720" w:footer="720" w:gutter="0"/>
@@ -649,6 +1076,304 @@
 <file path=word/numbering.xml><?xml version="1.0" encoding="utf-8"?>
 <w:numbering xmlns:wpc="http://schemas.microsoft.com/office/word/2010/wordprocessingCanvas" xmlns:cx="http://schemas.microsoft.com/office/drawing/2014/chartex" xmlns:cx1="http://schemas.microsoft.com/office/drawing/2015/9/8/chartex" xmlns:cx2="http://schemas.microsoft.com/office/drawing/2015/10/21/chartex" xmlns:cx3="http://schemas.microsoft.com/office/drawing/2016/5/9/chartex" xmlns:cx4="http://schemas.microsoft.com/office/drawing/2016/5/10/chartex" xmlns:cx5="http://schemas.microsoft.com/office/drawing/2016/5/11/chartex" xmlns:cx6="http://schemas.microsoft.com/office/drawing/2016/5/12/chartex" xmlns:cx7="http://schemas.microsoft.com/office/drawing/2016/5/13/chartex" xmlns:cx8="http://schemas.microsoft.com/office/drawing/2016/5/14/chartex" xmlns:mc="http://schemas.openxmlformats.org/markup-compatibility/2006" xmlns:aink="http://schemas.microsoft.com/office/drawing/2016/ink" xmlns:am3d="http://schemas.microsoft.com/office/drawing/2017/model3d" xmlns:o="urn:schemas-microsoft-com:office:office" xmlns:oel="http://schemas.microsoft.com/office/2019/extlst" xmlns:r="http://schemas.openxmlformats.org/officeDocument/2006/relationships" xmlns:m="http://schemas.openxmlformats.org/officeDocument/2006/math" xmlns:v="urn:schemas-microsoft-com:vml" xmlns:wp14="http://schemas.microsoft.com/office/word/2010/wordprocessingDrawing" xmlns:wp="http://schemas.openxmlformats.org/drawingml/2006/wordprocessingDrawing" xmlns:w10="urn:schemas-microsoft-com:office:word" xmlns:w="http://schemas.openxmlformats.org/wordprocessingml/2006/main" xmlns:w14="http://schemas.microsoft.com/office/word/2010/wordml" xmlns:w15="http://schemas.microsoft.com/office/word/2012/wordml" xmlns:w16cex="http://schemas.microsoft.com/office/word/2018/wordml/cex" xmlns:w16cid="http://schemas.microsoft.com/office/word/2016/wordml/cid" xmlns:w16="http://schemas.microsoft.com/office/word/2018/wordml" xmlns:w16du="http://schemas.microsoft.com/office/word/2023/wordml/word16du" xmlns:w16sdtdh="http://schemas.microsoft.com/office/word/2020/wordml/sdtdatahash" xmlns:w16sdtfl="http://schemas.microsoft.com/office/word/2024/wordml/sdtformatlock" xmlns:w16se="http://schemas.microsoft.com/office/word/2015/wordml/symex" xmlns:wpg="http://schemas.microsoft.com/office/word/2010/wordprocessingGroup" xmlns:wpi="http://schemas.microsoft.com/office/word/2010/wordprocessingInk" xmlns:wne="http://schemas.microsoft.com/office/word/2006/wordml" xmlns:wps="http://schemas.microsoft.com/office/word/2010/wordprocessingShape" mc:Ignorable="w14 w15 w16se w16cid w16 w16cex w16sdtdh w16sdtfl w16du wp14">
   <w:abstractNum w:abstractNumId="0" w15:restartNumberingAfterBreak="0">
+    <w:nsid w:val="02AF2633"/>
+    <w:multiLevelType w:val="multilevel"/>
+    <w:tmpl w:val="5EDEFD68"/>
+    <w:lvl w:ilvl="0">
+      <w:start w:val="1"/>
+      <w:numFmt w:val="bullet"/>
+      <w:lvlText w:val=""/>
+      <w:lvlJc w:val="left"/>
+      <w:pPr>
+        <w:tabs>
+          <w:tab w:val="num" w:pos="720"/>
+        </w:tabs>
+        <w:ind w:left="720" w:hanging="360"/>
+      </w:pPr>
+      <w:rPr>
+        <w:rFonts w:ascii="Symbol" w:hAnsi="Symbol" w:hint="default"/>
+        <w:sz w:val="20"/>
+      </w:rPr>
+    </w:lvl>
+    <w:lvl w:ilvl="1" w:tentative="1">
+      <w:start w:val="1"/>
+      <w:numFmt w:val="bullet"/>
+      <w:lvlText w:val=""/>
+      <w:lvlJc w:val="left"/>
+      <w:pPr>
+        <w:tabs>
+          <w:tab w:val="num" w:pos="1440"/>
+        </w:tabs>
+        <w:ind w:left="1440" w:hanging="360"/>
+      </w:pPr>
+      <w:rPr>
+        <w:rFonts w:ascii="Symbol" w:hAnsi="Symbol" w:hint="default"/>
+        <w:sz w:val="20"/>
+      </w:rPr>
+    </w:lvl>
+    <w:lvl w:ilvl="2" w:tentative="1">
+      <w:start w:val="1"/>
+      <w:numFmt w:val="bullet"/>
+      <w:lvlText w:val=""/>
+      <w:lvlJc w:val="left"/>
+      <w:pPr>
+        <w:tabs>
+          <w:tab w:val="num" w:pos="2160"/>
+        </w:tabs>
+        <w:ind w:left="2160" w:hanging="360"/>
+      </w:pPr>
+      <w:rPr>
+        <w:rFonts w:ascii="Symbol" w:hAnsi="Symbol" w:hint="default"/>
+        <w:sz w:val="20"/>
+      </w:rPr>
+    </w:lvl>
+    <w:lvl w:ilvl="3" w:tentative="1">
+      <w:start w:val="1"/>
+      <w:numFmt w:val="bullet"/>
+      <w:lvlText w:val=""/>
+      <w:lvlJc w:val="left"/>
+      <w:pPr>
+        <w:tabs>
+          <w:tab w:val="num" w:pos="2880"/>
+        </w:tabs>
+        <w:ind w:left="2880" w:hanging="360"/>
+      </w:pPr>
+      <w:rPr>
+        <w:rFonts w:ascii="Symbol" w:hAnsi="Symbol" w:hint="default"/>
+        <w:sz w:val="20"/>
+      </w:rPr>
+    </w:lvl>
+    <w:lvl w:ilvl="4" w:tentative="1">
+      <w:start w:val="1"/>
+      <w:numFmt w:val="bullet"/>
+      <w:lvlText w:val=""/>
+      <w:lvlJc w:val="left"/>
+      <w:pPr>
+        <w:tabs>
+          <w:tab w:val="num" w:pos="3600"/>
+        </w:tabs>
+        <w:ind w:left="3600" w:hanging="360"/>
+      </w:pPr>
+      <w:rPr>
+        <w:rFonts w:ascii="Symbol" w:hAnsi="Symbol" w:hint="default"/>
+        <w:sz w:val="20"/>
+      </w:rPr>
+    </w:lvl>
+    <w:lvl w:ilvl="5" w:tentative="1">
+      <w:start w:val="1"/>
+      <w:numFmt w:val="bullet"/>
+      <w:lvlText w:val=""/>
+      <w:lvlJc w:val="left"/>
+      <w:pPr>
+        <w:tabs>
+          <w:tab w:val="num" w:pos="4320"/>
+        </w:tabs>
+        <w:ind w:left="4320" w:hanging="360"/>
+      </w:pPr>
+      <w:rPr>
+        <w:rFonts w:ascii="Symbol" w:hAnsi="Symbol" w:hint="default"/>
+        <w:sz w:val="20"/>
+      </w:rPr>
+    </w:lvl>
+    <w:lvl w:ilvl="6" w:tentative="1">
+      <w:start w:val="1"/>
+      <w:numFmt w:val="bullet"/>
+      <w:lvlText w:val=""/>
+      <w:lvlJc w:val="left"/>
+      <w:pPr>
+        <w:tabs>
+          <w:tab w:val="num" w:pos="5040"/>
+        </w:tabs>
+        <w:ind w:left="5040" w:hanging="360"/>
+      </w:pPr>
+      <w:rPr>
+        <w:rFonts w:ascii="Symbol" w:hAnsi="Symbol" w:hint="default"/>
+        <w:sz w:val="20"/>
+      </w:rPr>
+    </w:lvl>
+    <w:lvl w:ilvl="7" w:tentative="1">
+      <w:start w:val="1"/>
+      <w:numFmt w:val="bullet"/>
+      <w:lvlText w:val=""/>
+      <w:lvlJc w:val="left"/>
+      <w:pPr>
+        <w:tabs>
+          <w:tab w:val="num" w:pos="5760"/>
+        </w:tabs>
+        <w:ind w:left="5760" w:hanging="360"/>
+      </w:pPr>
+      <w:rPr>
+        <w:rFonts w:ascii="Symbol" w:hAnsi="Symbol" w:hint="default"/>
+        <w:sz w:val="20"/>
+      </w:rPr>
+    </w:lvl>
+    <w:lvl w:ilvl="8" w:tentative="1">
+      <w:start w:val="1"/>
+      <w:numFmt w:val="bullet"/>
+      <w:lvlText w:val=""/>
+      <w:lvlJc w:val="left"/>
+      <w:pPr>
+        <w:tabs>
+          <w:tab w:val="num" w:pos="6480"/>
+        </w:tabs>
+        <w:ind w:left="6480" w:hanging="360"/>
+      </w:pPr>
+      <w:rPr>
+        <w:rFonts w:ascii="Symbol" w:hAnsi="Symbol" w:hint="default"/>
+        <w:sz w:val="20"/>
+      </w:rPr>
+    </w:lvl>
+  </w:abstractNum>
+  <w:abstractNum w:abstractNumId="1" w15:restartNumberingAfterBreak="0">
+    <w:nsid w:val="034D5C96"/>
+    <w:multiLevelType w:val="multilevel"/>
+    <w:tmpl w:val="3E14F5F4"/>
+    <w:lvl w:ilvl="0">
+      <w:start w:val="1"/>
+      <w:numFmt w:val="bullet"/>
+      <w:lvlText w:val=""/>
+      <w:lvlJc w:val="left"/>
+      <w:pPr>
+        <w:tabs>
+          <w:tab w:val="num" w:pos="720"/>
+        </w:tabs>
+        <w:ind w:left="720" w:hanging="360"/>
+      </w:pPr>
+      <w:rPr>
+        <w:rFonts w:ascii="Symbol" w:hAnsi="Symbol" w:hint="default"/>
+        <w:sz w:val="20"/>
+      </w:rPr>
+    </w:lvl>
+    <w:lvl w:ilvl="1" w:tentative="1">
+      <w:start w:val="1"/>
+      <w:numFmt w:val="bullet"/>
+      <w:lvlText w:val=""/>
+      <w:lvlJc w:val="left"/>
+      <w:pPr>
+        <w:tabs>
+          <w:tab w:val="num" w:pos="1440"/>
+        </w:tabs>
+        <w:ind w:left="1440" w:hanging="360"/>
+      </w:pPr>
+      <w:rPr>
+        <w:rFonts w:ascii="Symbol" w:hAnsi="Symbol" w:hint="default"/>
+        <w:sz w:val="20"/>
+      </w:rPr>
+    </w:lvl>
+    <w:lvl w:ilvl="2" w:tentative="1">
+      <w:start w:val="1"/>
+      <w:numFmt w:val="bullet"/>
+      <w:lvlText w:val=""/>
+      <w:lvlJc w:val="left"/>
+      <w:pPr>
+        <w:tabs>
+          <w:tab w:val="num" w:pos="2160"/>
+        </w:tabs>
+        <w:ind w:left="2160" w:hanging="360"/>
+      </w:pPr>
+      <w:rPr>
+        <w:rFonts w:ascii="Symbol" w:hAnsi="Symbol" w:hint="default"/>
+        <w:sz w:val="20"/>
+      </w:rPr>
+    </w:lvl>
+    <w:lvl w:ilvl="3" w:tentative="1">
+      <w:start w:val="1"/>
+      <w:numFmt w:val="bullet"/>
+      <w:lvlText w:val=""/>
+      <w:lvlJc w:val="left"/>
+      <w:pPr>
+        <w:tabs>
+          <w:tab w:val="num" w:pos="2880"/>
+        </w:tabs>
+        <w:ind w:left="2880" w:hanging="360"/>
+      </w:pPr>
+      <w:rPr>
+        <w:rFonts w:ascii="Symbol" w:hAnsi="Symbol" w:hint="default"/>
+        <w:sz w:val="20"/>
+      </w:rPr>
+    </w:lvl>
+    <w:lvl w:ilvl="4" w:tentative="1">
+      <w:start w:val="1"/>
+      <w:numFmt w:val="bullet"/>
+      <w:lvlText w:val=""/>
+      <w:lvlJc w:val="left"/>
+      <w:pPr>
+        <w:tabs>
+          <w:tab w:val="num" w:pos="3600"/>
+        </w:tabs>
+        <w:ind w:left="3600" w:hanging="360"/>
+      </w:pPr>
+      <w:rPr>
+        <w:rFonts w:ascii="Symbol" w:hAnsi="Symbol" w:hint="default"/>
+        <w:sz w:val="20"/>
+      </w:rPr>
+    </w:lvl>
+    <w:lvl w:ilvl="5" w:tentative="1">
+      <w:start w:val="1"/>
+      <w:numFmt w:val="bullet"/>
+      <w:lvlText w:val=""/>
+      <w:lvlJc w:val="left"/>
+      <w:pPr>
+        <w:tabs>
+          <w:tab w:val="num" w:pos="4320"/>
+        </w:tabs>
+        <w:ind w:left="4320" w:hanging="360"/>
+      </w:pPr>
+      <w:rPr>
+        <w:rFonts w:ascii="Symbol" w:hAnsi="Symbol" w:hint="default"/>
+        <w:sz w:val="20"/>
+      </w:rPr>
+    </w:lvl>
+    <w:lvl w:ilvl="6" w:tentative="1">
+      <w:start w:val="1"/>
+      <w:numFmt w:val="bullet"/>
+      <w:lvlText w:val=""/>
+      <w:lvlJc w:val="left"/>
+      <w:pPr>
+        <w:tabs>
+          <w:tab w:val="num" w:pos="5040"/>
+        </w:tabs>
+        <w:ind w:left="5040" w:hanging="360"/>
+      </w:pPr>
+      <w:rPr>
+        <w:rFonts w:ascii="Symbol" w:hAnsi="Symbol" w:hint="default"/>
+        <w:sz w:val="20"/>
+      </w:rPr>
+    </w:lvl>
+    <w:lvl w:ilvl="7" w:tentative="1">
+      <w:start w:val="1"/>
+      <w:numFmt w:val="bullet"/>
+      <w:lvlText w:val=""/>
+      <w:lvlJc w:val="left"/>
+      <w:pPr>
+        <w:tabs>
+          <w:tab w:val="num" w:pos="5760"/>
+        </w:tabs>
+        <w:ind w:left="5760" w:hanging="360"/>
+      </w:pPr>
+      <w:rPr>
+        <w:rFonts w:ascii="Symbol" w:hAnsi="Symbol" w:hint="default"/>
+        <w:sz w:val="20"/>
+      </w:rPr>
+    </w:lvl>
+    <w:lvl w:ilvl="8" w:tentative="1">
+      <w:start w:val="1"/>
+      <w:numFmt w:val="bullet"/>
+      <w:lvlText w:val=""/>
+      <w:lvlJc w:val="left"/>
+      <w:pPr>
+        <w:tabs>
+          <w:tab w:val="num" w:pos="6480"/>
+        </w:tabs>
+        <w:ind w:left="6480" w:hanging="360"/>
+      </w:pPr>
+      <w:rPr>
+        <w:rFonts w:ascii="Symbol" w:hAnsi="Symbol" w:hint="default"/>
+        <w:sz w:val="20"/>
+      </w:rPr>
+    </w:lvl>
+  </w:abstractNum>
+  <w:abstractNum w:abstractNumId="2" w15:restartNumberingAfterBreak="0">
     <w:nsid w:val="053453AE"/>
     <w:multiLevelType w:val="multilevel"/>
     <w:tmpl w:val="08A29C6E"/>
@@ -797,7 +1522,454 @@
       </w:rPr>
     </w:lvl>
   </w:abstractNum>
-  <w:abstractNum w:abstractNumId="1" w15:restartNumberingAfterBreak="0">
+  <w:abstractNum w:abstractNumId="3" w15:restartNumberingAfterBreak="0">
+    <w:nsid w:val="0EB979E5"/>
+    <w:multiLevelType w:val="multilevel"/>
+    <w:tmpl w:val="317851B2"/>
+    <w:lvl w:ilvl="0">
+      <w:start w:val="1"/>
+      <w:numFmt w:val="bullet"/>
+      <w:lvlText w:val=""/>
+      <w:lvlJc w:val="left"/>
+      <w:pPr>
+        <w:tabs>
+          <w:tab w:val="num" w:pos="720"/>
+        </w:tabs>
+        <w:ind w:left="720" w:hanging="360"/>
+      </w:pPr>
+      <w:rPr>
+        <w:rFonts w:ascii="Symbol" w:hAnsi="Symbol" w:hint="default"/>
+        <w:sz w:val="20"/>
+      </w:rPr>
+    </w:lvl>
+    <w:lvl w:ilvl="1" w:tentative="1">
+      <w:start w:val="1"/>
+      <w:numFmt w:val="bullet"/>
+      <w:lvlText w:val=""/>
+      <w:lvlJc w:val="left"/>
+      <w:pPr>
+        <w:tabs>
+          <w:tab w:val="num" w:pos="1440"/>
+        </w:tabs>
+        <w:ind w:left="1440" w:hanging="360"/>
+      </w:pPr>
+      <w:rPr>
+        <w:rFonts w:ascii="Symbol" w:hAnsi="Symbol" w:hint="default"/>
+        <w:sz w:val="20"/>
+      </w:rPr>
+    </w:lvl>
+    <w:lvl w:ilvl="2" w:tentative="1">
+      <w:start w:val="1"/>
+      <w:numFmt w:val="bullet"/>
+      <w:lvlText w:val=""/>
+      <w:lvlJc w:val="left"/>
+      <w:pPr>
+        <w:tabs>
+          <w:tab w:val="num" w:pos="2160"/>
+        </w:tabs>
+        <w:ind w:left="2160" w:hanging="360"/>
+      </w:pPr>
+      <w:rPr>
+        <w:rFonts w:ascii="Symbol" w:hAnsi="Symbol" w:hint="default"/>
+        <w:sz w:val="20"/>
+      </w:rPr>
+    </w:lvl>
+    <w:lvl w:ilvl="3" w:tentative="1">
+      <w:start w:val="1"/>
+      <w:numFmt w:val="bullet"/>
+      <w:lvlText w:val=""/>
+      <w:lvlJc w:val="left"/>
+      <w:pPr>
+        <w:tabs>
+          <w:tab w:val="num" w:pos="2880"/>
+        </w:tabs>
+        <w:ind w:left="2880" w:hanging="360"/>
+      </w:pPr>
+      <w:rPr>
+        <w:rFonts w:ascii="Symbol" w:hAnsi="Symbol" w:hint="default"/>
+        <w:sz w:val="20"/>
+      </w:rPr>
+    </w:lvl>
+    <w:lvl w:ilvl="4" w:tentative="1">
+      <w:start w:val="1"/>
+      <w:numFmt w:val="bullet"/>
+      <w:lvlText w:val=""/>
+      <w:lvlJc w:val="left"/>
+      <w:pPr>
+        <w:tabs>
+          <w:tab w:val="num" w:pos="3600"/>
+        </w:tabs>
+        <w:ind w:left="3600" w:hanging="360"/>
+      </w:pPr>
+      <w:rPr>
+        <w:rFonts w:ascii="Symbol" w:hAnsi="Symbol" w:hint="default"/>
+        <w:sz w:val="20"/>
+      </w:rPr>
+    </w:lvl>
+    <w:lvl w:ilvl="5" w:tentative="1">
+      <w:start w:val="1"/>
+      <w:numFmt w:val="bullet"/>
+      <w:lvlText w:val=""/>
+      <w:lvlJc w:val="left"/>
+      <w:pPr>
+        <w:tabs>
+          <w:tab w:val="num" w:pos="4320"/>
+        </w:tabs>
+        <w:ind w:left="4320" w:hanging="360"/>
+      </w:pPr>
+      <w:rPr>
+        <w:rFonts w:ascii="Symbol" w:hAnsi="Symbol" w:hint="default"/>
+        <w:sz w:val="20"/>
+      </w:rPr>
+    </w:lvl>
+    <w:lvl w:ilvl="6" w:tentative="1">
+      <w:start w:val="1"/>
+      <w:numFmt w:val="bullet"/>
+      <w:lvlText w:val=""/>
+      <w:lvlJc w:val="left"/>
+      <w:pPr>
+        <w:tabs>
+          <w:tab w:val="num" w:pos="5040"/>
+        </w:tabs>
+        <w:ind w:left="5040" w:hanging="360"/>
+      </w:pPr>
+      <w:rPr>
+        <w:rFonts w:ascii="Symbol" w:hAnsi="Symbol" w:hint="default"/>
+        <w:sz w:val="20"/>
+      </w:rPr>
+    </w:lvl>
+    <w:lvl w:ilvl="7" w:tentative="1">
+      <w:start w:val="1"/>
+      <w:numFmt w:val="bullet"/>
+      <w:lvlText w:val=""/>
+      <w:lvlJc w:val="left"/>
+      <w:pPr>
+        <w:tabs>
+          <w:tab w:val="num" w:pos="5760"/>
+        </w:tabs>
+        <w:ind w:left="5760" w:hanging="360"/>
+      </w:pPr>
+      <w:rPr>
+        <w:rFonts w:ascii="Symbol" w:hAnsi="Symbol" w:hint="default"/>
+        <w:sz w:val="20"/>
+      </w:rPr>
+    </w:lvl>
+    <w:lvl w:ilvl="8" w:tentative="1">
+      <w:start w:val="1"/>
+      <w:numFmt w:val="bullet"/>
+      <w:lvlText w:val=""/>
+      <w:lvlJc w:val="left"/>
+      <w:pPr>
+        <w:tabs>
+          <w:tab w:val="num" w:pos="6480"/>
+        </w:tabs>
+        <w:ind w:left="6480" w:hanging="360"/>
+      </w:pPr>
+      <w:rPr>
+        <w:rFonts w:ascii="Symbol" w:hAnsi="Symbol" w:hint="default"/>
+        <w:sz w:val="20"/>
+      </w:rPr>
+    </w:lvl>
+  </w:abstractNum>
+  <w:abstractNum w:abstractNumId="4" w15:restartNumberingAfterBreak="0">
+    <w:nsid w:val="11DB2867"/>
+    <w:multiLevelType w:val="multilevel"/>
+    <w:tmpl w:val="7D7C5C8C"/>
+    <w:lvl w:ilvl="0">
+      <w:start w:val="1"/>
+      <w:numFmt w:val="bullet"/>
+      <w:lvlText w:val=""/>
+      <w:lvlJc w:val="left"/>
+      <w:pPr>
+        <w:tabs>
+          <w:tab w:val="num" w:pos="720"/>
+        </w:tabs>
+        <w:ind w:left="720" w:hanging="360"/>
+      </w:pPr>
+      <w:rPr>
+        <w:rFonts w:ascii="Symbol" w:hAnsi="Symbol" w:hint="default"/>
+        <w:sz w:val="20"/>
+      </w:rPr>
+    </w:lvl>
+    <w:lvl w:ilvl="1" w:tentative="1">
+      <w:start w:val="1"/>
+      <w:numFmt w:val="bullet"/>
+      <w:lvlText w:val=""/>
+      <w:lvlJc w:val="left"/>
+      <w:pPr>
+        <w:tabs>
+          <w:tab w:val="num" w:pos="1440"/>
+        </w:tabs>
+        <w:ind w:left="1440" w:hanging="360"/>
+      </w:pPr>
+      <w:rPr>
+        <w:rFonts w:ascii="Symbol" w:hAnsi="Symbol" w:hint="default"/>
+        <w:sz w:val="20"/>
+      </w:rPr>
+    </w:lvl>
+    <w:lvl w:ilvl="2" w:tentative="1">
+      <w:start w:val="1"/>
+      <w:numFmt w:val="bullet"/>
+      <w:lvlText w:val=""/>
+      <w:lvlJc w:val="left"/>
+      <w:pPr>
+        <w:tabs>
+          <w:tab w:val="num" w:pos="2160"/>
+        </w:tabs>
+        <w:ind w:left="2160" w:hanging="360"/>
+      </w:pPr>
+      <w:rPr>
+        <w:rFonts w:ascii="Symbol" w:hAnsi="Symbol" w:hint="default"/>
+        <w:sz w:val="20"/>
+      </w:rPr>
+    </w:lvl>
+    <w:lvl w:ilvl="3" w:tentative="1">
+      <w:start w:val="1"/>
+      <w:numFmt w:val="bullet"/>
+      <w:lvlText w:val=""/>
+      <w:lvlJc w:val="left"/>
+      <w:pPr>
+        <w:tabs>
+          <w:tab w:val="num" w:pos="2880"/>
+        </w:tabs>
+        <w:ind w:left="2880" w:hanging="360"/>
+      </w:pPr>
+      <w:rPr>
+        <w:rFonts w:ascii="Symbol" w:hAnsi="Symbol" w:hint="default"/>
+        <w:sz w:val="20"/>
+      </w:rPr>
+    </w:lvl>
+    <w:lvl w:ilvl="4" w:tentative="1">
+      <w:start w:val="1"/>
+      <w:numFmt w:val="bullet"/>
+      <w:lvlText w:val=""/>
+      <w:lvlJc w:val="left"/>
+      <w:pPr>
+        <w:tabs>
+          <w:tab w:val="num" w:pos="3600"/>
+        </w:tabs>
+        <w:ind w:left="3600" w:hanging="360"/>
+      </w:pPr>
+      <w:rPr>
+        <w:rFonts w:ascii="Symbol" w:hAnsi="Symbol" w:hint="default"/>
+        <w:sz w:val="20"/>
+      </w:rPr>
+    </w:lvl>
+    <w:lvl w:ilvl="5" w:tentative="1">
+      <w:start w:val="1"/>
+      <w:numFmt w:val="bullet"/>
+      <w:lvlText w:val=""/>
+      <w:lvlJc w:val="left"/>
+      <w:pPr>
+        <w:tabs>
+          <w:tab w:val="num" w:pos="4320"/>
+        </w:tabs>
+        <w:ind w:left="4320" w:hanging="360"/>
+      </w:pPr>
+      <w:rPr>
+        <w:rFonts w:ascii="Symbol" w:hAnsi="Symbol" w:hint="default"/>
+        <w:sz w:val="20"/>
+      </w:rPr>
+    </w:lvl>
+    <w:lvl w:ilvl="6" w:tentative="1">
+      <w:start w:val="1"/>
+      <w:numFmt w:val="bullet"/>
+      <w:lvlText w:val=""/>
+      <w:lvlJc w:val="left"/>
+      <w:pPr>
+        <w:tabs>
+          <w:tab w:val="num" w:pos="5040"/>
+        </w:tabs>
+        <w:ind w:left="5040" w:hanging="360"/>
+      </w:pPr>
+      <w:rPr>
+        <w:rFonts w:ascii="Symbol" w:hAnsi="Symbol" w:hint="default"/>
+        <w:sz w:val="20"/>
+      </w:rPr>
+    </w:lvl>
+    <w:lvl w:ilvl="7" w:tentative="1">
+      <w:start w:val="1"/>
+      <w:numFmt w:val="bullet"/>
+      <w:lvlText w:val=""/>
+      <w:lvlJc w:val="left"/>
+      <w:pPr>
+        <w:tabs>
+          <w:tab w:val="num" w:pos="5760"/>
+        </w:tabs>
+        <w:ind w:left="5760" w:hanging="360"/>
+      </w:pPr>
+      <w:rPr>
+        <w:rFonts w:ascii="Symbol" w:hAnsi="Symbol" w:hint="default"/>
+        <w:sz w:val="20"/>
+      </w:rPr>
+    </w:lvl>
+    <w:lvl w:ilvl="8" w:tentative="1">
+      <w:start w:val="1"/>
+      <w:numFmt w:val="bullet"/>
+      <w:lvlText w:val=""/>
+      <w:lvlJc w:val="left"/>
+      <w:pPr>
+        <w:tabs>
+          <w:tab w:val="num" w:pos="6480"/>
+        </w:tabs>
+        <w:ind w:left="6480" w:hanging="360"/>
+      </w:pPr>
+      <w:rPr>
+        <w:rFonts w:ascii="Symbol" w:hAnsi="Symbol" w:hint="default"/>
+        <w:sz w:val="20"/>
+      </w:rPr>
+    </w:lvl>
+  </w:abstractNum>
+  <w:abstractNum w:abstractNumId="5" w15:restartNumberingAfterBreak="0">
+    <w:nsid w:val="14466D36"/>
+    <w:multiLevelType w:val="multilevel"/>
+    <w:tmpl w:val="00FAE094"/>
+    <w:lvl w:ilvl="0">
+      <w:start w:val="1"/>
+      <w:numFmt w:val="bullet"/>
+      <w:lvlText w:val=""/>
+      <w:lvlJc w:val="left"/>
+      <w:pPr>
+        <w:tabs>
+          <w:tab w:val="num" w:pos="720"/>
+        </w:tabs>
+        <w:ind w:left="720" w:hanging="360"/>
+      </w:pPr>
+      <w:rPr>
+        <w:rFonts w:ascii="Symbol" w:hAnsi="Symbol" w:hint="default"/>
+        <w:sz w:val="20"/>
+      </w:rPr>
+    </w:lvl>
+    <w:lvl w:ilvl="1" w:tentative="1">
+      <w:start w:val="1"/>
+      <w:numFmt w:val="bullet"/>
+      <w:lvlText w:val=""/>
+      <w:lvlJc w:val="left"/>
+      <w:pPr>
+        <w:tabs>
+          <w:tab w:val="num" w:pos="1440"/>
+        </w:tabs>
+        <w:ind w:left="1440" w:hanging="360"/>
+      </w:pPr>
+      <w:rPr>
+        <w:rFonts w:ascii="Symbol" w:hAnsi="Symbol" w:hint="default"/>
+        <w:sz w:val="20"/>
+      </w:rPr>
+    </w:lvl>
+    <w:lvl w:ilvl="2" w:tentative="1">
+      <w:start w:val="1"/>
+      <w:numFmt w:val="bullet"/>
+      <w:lvlText w:val=""/>
+      <w:lvlJc w:val="left"/>
+      <w:pPr>
+        <w:tabs>
+          <w:tab w:val="num" w:pos="2160"/>
+        </w:tabs>
+        <w:ind w:left="2160" w:hanging="360"/>
+      </w:pPr>
+      <w:rPr>
+        <w:rFonts w:ascii="Symbol" w:hAnsi="Symbol" w:hint="default"/>
+        <w:sz w:val="20"/>
+      </w:rPr>
+    </w:lvl>
+    <w:lvl w:ilvl="3" w:tentative="1">
+      <w:start w:val="1"/>
+      <w:numFmt w:val="bullet"/>
+      <w:lvlText w:val=""/>
+      <w:lvlJc w:val="left"/>
+      <w:pPr>
+        <w:tabs>
+          <w:tab w:val="num" w:pos="2880"/>
+        </w:tabs>
+        <w:ind w:left="2880" w:hanging="360"/>
+      </w:pPr>
+      <w:rPr>
+        <w:rFonts w:ascii="Symbol" w:hAnsi="Symbol" w:hint="default"/>
+        <w:sz w:val="20"/>
+      </w:rPr>
+    </w:lvl>
+    <w:lvl w:ilvl="4" w:tentative="1">
+      <w:start w:val="1"/>
+      <w:numFmt w:val="bullet"/>
+      <w:lvlText w:val=""/>
+      <w:lvlJc w:val="left"/>
+      <w:pPr>
+        <w:tabs>
+          <w:tab w:val="num" w:pos="3600"/>
+        </w:tabs>
+        <w:ind w:left="3600" w:hanging="360"/>
+      </w:pPr>
+      <w:rPr>
+        <w:rFonts w:ascii="Symbol" w:hAnsi="Symbol" w:hint="default"/>
+        <w:sz w:val="20"/>
+      </w:rPr>
+    </w:lvl>
+    <w:lvl w:ilvl="5" w:tentative="1">
+      <w:start w:val="1"/>
+      <w:numFmt w:val="bullet"/>
+      <w:lvlText w:val=""/>
+      <w:lvlJc w:val="left"/>
+      <w:pPr>
+        <w:tabs>
+          <w:tab w:val="num" w:pos="4320"/>
+        </w:tabs>
+        <w:ind w:left="4320" w:hanging="360"/>
+      </w:pPr>
+      <w:rPr>
+        <w:rFonts w:ascii="Symbol" w:hAnsi="Symbol" w:hint="default"/>
+        <w:sz w:val="20"/>
+      </w:rPr>
+    </w:lvl>
+    <w:lvl w:ilvl="6" w:tentative="1">
+      <w:start w:val="1"/>
+      <w:numFmt w:val="bullet"/>
+      <w:lvlText w:val=""/>
+      <w:lvlJc w:val="left"/>
+      <w:pPr>
+        <w:tabs>
+          <w:tab w:val="num" w:pos="5040"/>
+        </w:tabs>
+        <w:ind w:left="5040" w:hanging="360"/>
+      </w:pPr>
+      <w:rPr>
+        <w:rFonts w:ascii="Symbol" w:hAnsi="Symbol" w:hint="default"/>
+        <w:sz w:val="20"/>
+      </w:rPr>
+    </w:lvl>
+    <w:lvl w:ilvl="7" w:tentative="1">
+      <w:start w:val="1"/>
+      <w:numFmt w:val="bullet"/>
+      <w:lvlText w:val=""/>
+      <w:lvlJc w:val="left"/>
+      <w:pPr>
+        <w:tabs>
+          <w:tab w:val="num" w:pos="5760"/>
+        </w:tabs>
+        <w:ind w:left="5760" w:hanging="360"/>
+      </w:pPr>
+      <w:rPr>
+        <w:rFonts w:ascii="Symbol" w:hAnsi="Symbol" w:hint="default"/>
+        <w:sz w:val="20"/>
+      </w:rPr>
+    </w:lvl>
+    <w:lvl w:ilvl="8" w:tentative="1">
+      <w:start w:val="1"/>
+      <w:numFmt w:val="bullet"/>
+      <w:lvlText w:val=""/>
+      <w:lvlJc w:val="left"/>
+      <w:pPr>
+        <w:tabs>
+          <w:tab w:val="num" w:pos="6480"/>
+        </w:tabs>
+        <w:ind w:left="6480" w:hanging="360"/>
+      </w:pPr>
+      <w:rPr>
+        <w:rFonts w:ascii="Symbol" w:hAnsi="Symbol" w:hint="default"/>
+        <w:sz w:val="20"/>
+      </w:rPr>
+    </w:lvl>
+  </w:abstractNum>
+  <w:abstractNum w:abstractNumId="6" w15:restartNumberingAfterBreak="0">
     <w:nsid w:val="26C75295"/>
     <w:multiLevelType w:val="multilevel"/>
     <w:tmpl w:val="D7E2861C"/>
@@ -946,7 +2118,7 @@
       </w:rPr>
     </w:lvl>
   </w:abstractNum>
-  <w:abstractNum w:abstractNumId="2" w15:restartNumberingAfterBreak="0">
+  <w:abstractNum w:abstractNumId="7" w15:restartNumberingAfterBreak="0">
     <w:nsid w:val="3529131E"/>
     <w:multiLevelType w:val="multilevel"/>
     <w:tmpl w:val="1848D740"/>
@@ -1095,7 +2267,7 @@
       </w:rPr>
     </w:lvl>
   </w:abstractNum>
-  <w:abstractNum w:abstractNumId="3" w15:restartNumberingAfterBreak="0">
+  <w:abstractNum w:abstractNumId="8" w15:restartNumberingAfterBreak="0">
     <w:nsid w:val="3BF0192B"/>
     <w:multiLevelType w:val="multilevel"/>
     <w:tmpl w:val="9EF0D4E2"/>
@@ -1244,7 +2416,305 @@
       </w:rPr>
     </w:lvl>
   </w:abstractNum>
-  <w:abstractNum w:abstractNumId="4" w15:restartNumberingAfterBreak="0">
+  <w:abstractNum w:abstractNumId="9" w15:restartNumberingAfterBreak="0">
+    <w:nsid w:val="3E3D5C6C"/>
+    <w:multiLevelType w:val="multilevel"/>
+    <w:tmpl w:val="C2CEE9BE"/>
+    <w:lvl w:ilvl="0">
+      <w:start w:val="1"/>
+      <w:numFmt w:val="bullet"/>
+      <w:lvlText w:val=""/>
+      <w:lvlJc w:val="left"/>
+      <w:pPr>
+        <w:tabs>
+          <w:tab w:val="num" w:pos="720"/>
+        </w:tabs>
+        <w:ind w:left="720" w:hanging="360"/>
+      </w:pPr>
+      <w:rPr>
+        <w:rFonts w:ascii="Symbol" w:hAnsi="Symbol" w:hint="default"/>
+        <w:sz w:val="20"/>
+      </w:rPr>
+    </w:lvl>
+    <w:lvl w:ilvl="1" w:tentative="1">
+      <w:start w:val="1"/>
+      <w:numFmt w:val="bullet"/>
+      <w:lvlText w:val=""/>
+      <w:lvlJc w:val="left"/>
+      <w:pPr>
+        <w:tabs>
+          <w:tab w:val="num" w:pos="1440"/>
+        </w:tabs>
+        <w:ind w:left="1440" w:hanging="360"/>
+      </w:pPr>
+      <w:rPr>
+        <w:rFonts w:ascii="Symbol" w:hAnsi="Symbol" w:hint="default"/>
+        <w:sz w:val="20"/>
+      </w:rPr>
+    </w:lvl>
+    <w:lvl w:ilvl="2" w:tentative="1">
+      <w:start w:val="1"/>
+      <w:numFmt w:val="bullet"/>
+      <w:lvlText w:val=""/>
+      <w:lvlJc w:val="left"/>
+      <w:pPr>
+        <w:tabs>
+          <w:tab w:val="num" w:pos="2160"/>
+        </w:tabs>
+        <w:ind w:left="2160" w:hanging="360"/>
+      </w:pPr>
+      <w:rPr>
+        <w:rFonts w:ascii="Symbol" w:hAnsi="Symbol" w:hint="default"/>
+        <w:sz w:val="20"/>
+      </w:rPr>
+    </w:lvl>
+    <w:lvl w:ilvl="3" w:tentative="1">
+      <w:start w:val="1"/>
+      <w:numFmt w:val="bullet"/>
+      <w:lvlText w:val=""/>
+      <w:lvlJc w:val="left"/>
+      <w:pPr>
+        <w:tabs>
+          <w:tab w:val="num" w:pos="2880"/>
+        </w:tabs>
+        <w:ind w:left="2880" w:hanging="360"/>
+      </w:pPr>
+      <w:rPr>
+        <w:rFonts w:ascii="Symbol" w:hAnsi="Symbol" w:hint="default"/>
+        <w:sz w:val="20"/>
+      </w:rPr>
+    </w:lvl>
+    <w:lvl w:ilvl="4" w:tentative="1">
+      <w:start w:val="1"/>
+      <w:numFmt w:val="bullet"/>
+      <w:lvlText w:val=""/>
+      <w:lvlJc w:val="left"/>
+      <w:pPr>
+        <w:tabs>
+          <w:tab w:val="num" w:pos="3600"/>
+        </w:tabs>
+        <w:ind w:left="3600" w:hanging="360"/>
+      </w:pPr>
+      <w:rPr>
+        <w:rFonts w:ascii="Symbol" w:hAnsi="Symbol" w:hint="default"/>
+        <w:sz w:val="20"/>
+      </w:rPr>
+    </w:lvl>
+    <w:lvl w:ilvl="5" w:tentative="1">
+      <w:start w:val="1"/>
+      <w:numFmt w:val="bullet"/>
+      <w:lvlText w:val=""/>
+      <w:lvlJc w:val="left"/>
+      <w:pPr>
+        <w:tabs>
+          <w:tab w:val="num" w:pos="4320"/>
+        </w:tabs>
+        <w:ind w:left="4320" w:hanging="360"/>
+      </w:pPr>
+      <w:rPr>
+        <w:rFonts w:ascii="Symbol" w:hAnsi="Symbol" w:hint="default"/>
+        <w:sz w:val="20"/>
+      </w:rPr>
+    </w:lvl>
+    <w:lvl w:ilvl="6" w:tentative="1">
+      <w:start w:val="1"/>
+      <w:numFmt w:val="bullet"/>
+      <w:lvlText w:val=""/>
+      <w:lvlJc w:val="left"/>
+      <w:pPr>
+        <w:tabs>
+          <w:tab w:val="num" w:pos="5040"/>
+        </w:tabs>
+        <w:ind w:left="5040" w:hanging="360"/>
+      </w:pPr>
+      <w:rPr>
+        <w:rFonts w:ascii="Symbol" w:hAnsi="Symbol" w:hint="default"/>
+        <w:sz w:val="20"/>
+      </w:rPr>
+    </w:lvl>
+    <w:lvl w:ilvl="7" w:tentative="1">
+      <w:start w:val="1"/>
+      <w:numFmt w:val="bullet"/>
+      <w:lvlText w:val=""/>
+      <w:lvlJc w:val="left"/>
+      <w:pPr>
+        <w:tabs>
+          <w:tab w:val="num" w:pos="5760"/>
+        </w:tabs>
+        <w:ind w:left="5760" w:hanging="360"/>
+      </w:pPr>
+      <w:rPr>
+        <w:rFonts w:ascii="Symbol" w:hAnsi="Symbol" w:hint="default"/>
+        <w:sz w:val="20"/>
+      </w:rPr>
+    </w:lvl>
+    <w:lvl w:ilvl="8" w:tentative="1">
+      <w:start w:val="1"/>
+      <w:numFmt w:val="bullet"/>
+      <w:lvlText w:val=""/>
+      <w:lvlJc w:val="left"/>
+      <w:pPr>
+        <w:tabs>
+          <w:tab w:val="num" w:pos="6480"/>
+        </w:tabs>
+        <w:ind w:left="6480" w:hanging="360"/>
+      </w:pPr>
+      <w:rPr>
+        <w:rFonts w:ascii="Symbol" w:hAnsi="Symbol" w:hint="default"/>
+        <w:sz w:val="20"/>
+      </w:rPr>
+    </w:lvl>
+  </w:abstractNum>
+  <w:abstractNum w:abstractNumId="10" w15:restartNumberingAfterBreak="0">
+    <w:nsid w:val="3F4E5E26"/>
+    <w:multiLevelType w:val="multilevel"/>
+    <w:tmpl w:val="33E2D38C"/>
+    <w:lvl w:ilvl="0">
+      <w:start w:val="1"/>
+      <w:numFmt w:val="bullet"/>
+      <w:lvlText w:val=""/>
+      <w:lvlJc w:val="left"/>
+      <w:pPr>
+        <w:tabs>
+          <w:tab w:val="num" w:pos="720"/>
+        </w:tabs>
+        <w:ind w:left="720" w:hanging="360"/>
+      </w:pPr>
+      <w:rPr>
+        <w:rFonts w:ascii="Symbol" w:hAnsi="Symbol" w:hint="default"/>
+        <w:sz w:val="20"/>
+      </w:rPr>
+    </w:lvl>
+    <w:lvl w:ilvl="1" w:tentative="1">
+      <w:start w:val="1"/>
+      <w:numFmt w:val="bullet"/>
+      <w:lvlText w:val=""/>
+      <w:lvlJc w:val="left"/>
+      <w:pPr>
+        <w:tabs>
+          <w:tab w:val="num" w:pos="1440"/>
+        </w:tabs>
+        <w:ind w:left="1440" w:hanging="360"/>
+      </w:pPr>
+      <w:rPr>
+        <w:rFonts w:ascii="Symbol" w:hAnsi="Symbol" w:hint="default"/>
+        <w:sz w:val="20"/>
+      </w:rPr>
+    </w:lvl>
+    <w:lvl w:ilvl="2" w:tentative="1">
+      <w:start w:val="1"/>
+      <w:numFmt w:val="bullet"/>
+      <w:lvlText w:val=""/>
+      <w:lvlJc w:val="left"/>
+      <w:pPr>
+        <w:tabs>
+          <w:tab w:val="num" w:pos="2160"/>
+        </w:tabs>
+        <w:ind w:left="2160" w:hanging="360"/>
+      </w:pPr>
+      <w:rPr>
+        <w:rFonts w:ascii="Symbol" w:hAnsi="Symbol" w:hint="default"/>
+        <w:sz w:val="20"/>
+      </w:rPr>
+    </w:lvl>
+    <w:lvl w:ilvl="3" w:tentative="1">
+      <w:start w:val="1"/>
+      <w:numFmt w:val="bullet"/>
+      <w:lvlText w:val=""/>
+      <w:lvlJc w:val="left"/>
+      <w:pPr>
+        <w:tabs>
+          <w:tab w:val="num" w:pos="2880"/>
+        </w:tabs>
+        <w:ind w:left="2880" w:hanging="360"/>
+      </w:pPr>
+      <w:rPr>
+        <w:rFonts w:ascii="Symbol" w:hAnsi="Symbol" w:hint="default"/>
+        <w:sz w:val="20"/>
+      </w:rPr>
+    </w:lvl>
+    <w:lvl w:ilvl="4" w:tentative="1">
+      <w:start w:val="1"/>
+      <w:numFmt w:val="bullet"/>
+      <w:lvlText w:val=""/>
+      <w:lvlJc w:val="left"/>
+      <w:pPr>
+        <w:tabs>
+          <w:tab w:val="num" w:pos="3600"/>
+        </w:tabs>
+        <w:ind w:left="3600" w:hanging="360"/>
+      </w:pPr>
+      <w:rPr>
+        <w:rFonts w:ascii="Symbol" w:hAnsi="Symbol" w:hint="default"/>
+        <w:sz w:val="20"/>
+      </w:rPr>
+    </w:lvl>
+    <w:lvl w:ilvl="5" w:tentative="1">
+      <w:start w:val="1"/>
+      <w:numFmt w:val="bullet"/>
+      <w:lvlText w:val=""/>
+      <w:lvlJc w:val="left"/>
+      <w:pPr>
+        <w:tabs>
+          <w:tab w:val="num" w:pos="4320"/>
+        </w:tabs>
+        <w:ind w:left="4320" w:hanging="360"/>
+      </w:pPr>
+      <w:rPr>
+        <w:rFonts w:ascii="Symbol" w:hAnsi="Symbol" w:hint="default"/>
+        <w:sz w:val="20"/>
+      </w:rPr>
+    </w:lvl>
+    <w:lvl w:ilvl="6" w:tentative="1">
+      <w:start w:val="1"/>
+      <w:numFmt w:val="bullet"/>
+      <w:lvlText w:val=""/>
+      <w:lvlJc w:val="left"/>
+      <w:pPr>
+        <w:tabs>
+          <w:tab w:val="num" w:pos="5040"/>
+        </w:tabs>
+        <w:ind w:left="5040" w:hanging="360"/>
+      </w:pPr>
+      <w:rPr>
+        <w:rFonts w:ascii="Symbol" w:hAnsi="Symbol" w:hint="default"/>
+        <w:sz w:val="20"/>
+      </w:rPr>
+    </w:lvl>
+    <w:lvl w:ilvl="7" w:tentative="1">
+      <w:start w:val="1"/>
+      <w:numFmt w:val="bullet"/>
+      <w:lvlText w:val=""/>
+      <w:lvlJc w:val="left"/>
+      <w:pPr>
+        <w:tabs>
+          <w:tab w:val="num" w:pos="5760"/>
+        </w:tabs>
+        <w:ind w:left="5760" w:hanging="360"/>
+      </w:pPr>
+      <w:rPr>
+        <w:rFonts w:ascii="Symbol" w:hAnsi="Symbol" w:hint="default"/>
+        <w:sz w:val="20"/>
+      </w:rPr>
+    </w:lvl>
+    <w:lvl w:ilvl="8" w:tentative="1">
+      <w:start w:val="1"/>
+      <w:numFmt w:val="bullet"/>
+      <w:lvlText w:val=""/>
+      <w:lvlJc w:val="left"/>
+      <w:pPr>
+        <w:tabs>
+          <w:tab w:val="num" w:pos="6480"/>
+        </w:tabs>
+        <w:ind w:left="6480" w:hanging="360"/>
+      </w:pPr>
+      <w:rPr>
+        <w:rFonts w:ascii="Symbol" w:hAnsi="Symbol" w:hint="default"/>
+        <w:sz w:val="20"/>
+      </w:rPr>
+    </w:lvl>
+  </w:abstractNum>
+  <w:abstractNum w:abstractNumId="11" w15:restartNumberingAfterBreak="0">
     <w:nsid w:val="509C41E7"/>
     <w:multiLevelType w:val="multilevel"/>
     <w:tmpl w:val="16BC92AC"/>
@@ -1393,7 +2863,454 @@
       </w:rPr>
     </w:lvl>
   </w:abstractNum>
-  <w:abstractNum w:abstractNumId="5" w15:restartNumberingAfterBreak="0">
+  <w:abstractNum w:abstractNumId="12" w15:restartNumberingAfterBreak="0">
+    <w:nsid w:val="5AA11218"/>
+    <w:multiLevelType w:val="multilevel"/>
+    <w:tmpl w:val="B3BCA1BE"/>
+    <w:lvl w:ilvl="0">
+      <w:start w:val="1"/>
+      <w:numFmt w:val="bullet"/>
+      <w:lvlText w:val=""/>
+      <w:lvlJc w:val="left"/>
+      <w:pPr>
+        <w:tabs>
+          <w:tab w:val="num" w:pos="720"/>
+        </w:tabs>
+        <w:ind w:left="720" w:hanging="360"/>
+      </w:pPr>
+      <w:rPr>
+        <w:rFonts w:ascii="Symbol" w:hAnsi="Symbol" w:hint="default"/>
+        <w:sz w:val="20"/>
+      </w:rPr>
+    </w:lvl>
+    <w:lvl w:ilvl="1" w:tentative="1">
+      <w:start w:val="1"/>
+      <w:numFmt w:val="bullet"/>
+      <w:lvlText w:val=""/>
+      <w:lvlJc w:val="left"/>
+      <w:pPr>
+        <w:tabs>
+          <w:tab w:val="num" w:pos="1440"/>
+        </w:tabs>
+        <w:ind w:left="1440" w:hanging="360"/>
+      </w:pPr>
+      <w:rPr>
+        <w:rFonts w:ascii="Symbol" w:hAnsi="Symbol" w:hint="default"/>
+        <w:sz w:val="20"/>
+      </w:rPr>
+    </w:lvl>
+    <w:lvl w:ilvl="2" w:tentative="1">
+      <w:start w:val="1"/>
+      <w:numFmt w:val="bullet"/>
+      <w:lvlText w:val=""/>
+      <w:lvlJc w:val="left"/>
+      <w:pPr>
+        <w:tabs>
+          <w:tab w:val="num" w:pos="2160"/>
+        </w:tabs>
+        <w:ind w:left="2160" w:hanging="360"/>
+      </w:pPr>
+      <w:rPr>
+        <w:rFonts w:ascii="Symbol" w:hAnsi="Symbol" w:hint="default"/>
+        <w:sz w:val="20"/>
+      </w:rPr>
+    </w:lvl>
+    <w:lvl w:ilvl="3" w:tentative="1">
+      <w:start w:val="1"/>
+      <w:numFmt w:val="bullet"/>
+      <w:lvlText w:val=""/>
+      <w:lvlJc w:val="left"/>
+      <w:pPr>
+        <w:tabs>
+          <w:tab w:val="num" w:pos="2880"/>
+        </w:tabs>
+        <w:ind w:left="2880" w:hanging="360"/>
+      </w:pPr>
+      <w:rPr>
+        <w:rFonts w:ascii="Symbol" w:hAnsi="Symbol" w:hint="default"/>
+        <w:sz w:val="20"/>
+      </w:rPr>
+    </w:lvl>
+    <w:lvl w:ilvl="4" w:tentative="1">
+      <w:start w:val="1"/>
+      <w:numFmt w:val="bullet"/>
+      <w:lvlText w:val=""/>
+      <w:lvlJc w:val="left"/>
+      <w:pPr>
+        <w:tabs>
+          <w:tab w:val="num" w:pos="3600"/>
+        </w:tabs>
+        <w:ind w:left="3600" w:hanging="360"/>
+      </w:pPr>
+      <w:rPr>
+        <w:rFonts w:ascii="Symbol" w:hAnsi="Symbol" w:hint="default"/>
+        <w:sz w:val="20"/>
+      </w:rPr>
+    </w:lvl>
+    <w:lvl w:ilvl="5" w:tentative="1">
+      <w:start w:val="1"/>
+      <w:numFmt w:val="bullet"/>
+      <w:lvlText w:val=""/>
+      <w:lvlJc w:val="left"/>
+      <w:pPr>
+        <w:tabs>
+          <w:tab w:val="num" w:pos="4320"/>
+        </w:tabs>
+        <w:ind w:left="4320" w:hanging="360"/>
+      </w:pPr>
+      <w:rPr>
+        <w:rFonts w:ascii="Symbol" w:hAnsi="Symbol" w:hint="default"/>
+        <w:sz w:val="20"/>
+      </w:rPr>
+    </w:lvl>
+    <w:lvl w:ilvl="6" w:tentative="1">
+      <w:start w:val="1"/>
+      <w:numFmt w:val="bullet"/>
+      <w:lvlText w:val=""/>
+      <w:lvlJc w:val="left"/>
+      <w:pPr>
+        <w:tabs>
+          <w:tab w:val="num" w:pos="5040"/>
+        </w:tabs>
+        <w:ind w:left="5040" w:hanging="360"/>
+      </w:pPr>
+      <w:rPr>
+        <w:rFonts w:ascii="Symbol" w:hAnsi="Symbol" w:hint="default"/>
+        <w:sz w:val="20"/>
+      </w:rPr>
+    </w:lvl>
+    <w:lvl w:ilvl="7" w:tentative="1">
+      <w:start w:val="1"/>
+      <w:numFmt w:val="bullet"/>
+      <w:lvlText w:val=""/>
+      <w:lvlJc w:val="left"/>
+      <w:pPr>
+        <w:tabs>
+          <w:tab w:val="num" w:pos="5760"/>
+        </w:tabs>
+        <w:ind w:left="5760" w:hanging="360"/>
+      </w:pPr>
+      <w:rPr>
+        <w:rFonts w:ascii="Symbol" w:hAnsi="Symbol" w:hint="default"/>
+        <w:sz w:val="20"/>
+      </w:rPr>
+    </w:lvl>
+    <w:lvl w:ilvl="8" w:tentative="1">
+      <w:start w:val="1"/>
+      <w:numFmt w:val="bullet"/>
+      <w:lvlText w:val=""/>
+      <w:lvlJc w:val="left"/>
+      <w:pPr>
+        <w:tabs>
+          <w:tab w:val="num" w:pos="6480"/>
+        </w:tabs>
+        <w:ind w:left="6480" w:hanging="360"/>
+      </w:pPr>
+      <w:rPr>
+        <w:rFonts w:ascii="Symbol" w:hAnsi="Symbol" w:hint="default"/>
+        <w:sz w:val="20"/>
+      </w:rPr>
+    </w:lvl>
+  </w:abstractNum>
+  <w:abstractNum w:abstractNumId="13" w15:restartNumberingAfterBreak="0">
+    <w:nsid w:val="5B1A32A3"/>
+    <w:multiLevelType w:val="multilevel"/>
+    <w:tmpl w:val="907200DC"/>
+    <w:lvl w:ilvl="0">
+      <w:start w:val="1"/>
+      <w:numFmt w:val="bullet"/>
+      <w:lvlText w:val=""/>
+      <w:lvlJc w:val="left"/>
+      <w:pPr>
+        <w:tabs>
+          <w:tab w:val="num" w:pos="720"/>
+        </w:tabs>
+        <w:ind w:left="720" w:hanging="360"/>
+      </w:pPr>
+      <w:rPr>
+        <w:rFonts w:ascii="Symbol" w:hAnsi="Symbol" w:hint="default"/>
+        <w:sz w:val="20"/>
+      </w:rPr>
+    </w:lvl>
+    <w:lvl w:ilvl="1" w:tentative="1">
+      <w:start w:val="1"/>
+      <w:numFmt w:val="bullet"/>
+      <w:lvlText w:val=""/>
+      <w:lvlJc w:val="left"/>
+      <w:pPr>
+        <w:tabs>
+          <w:tab w:val="num" w:pos="1440"/>
+        </w:tabs>
+        <w:ind w:left="1440" w:hanging="360"/>
+      </w:pPr>
+      <w:rPr>
+        <w:rFonts w:ascii="Symbol" w:hAnsi="Symbol" w:hint="default"/>
+        <w:sz w:val="20"/>
+      </w:rPr>
+    </w:lvl>
+    <w:lvl w:ilvl="2" w:tentative="1">
+      <w:start w:val="1"/>
+      <w:numFmt w:val="bullet"/>
+      <w:lvlText w:val=""/>
+      <w:lvlJc w:val="left"/>
+      <w:pPr>
+        <w:tabs>
+          <w:tab w:val="num" w:pos="2160"/>
+        </w:tabs>
+        <w:ind w:left="2160" w:hanging="360"/>
+      </w:pPr>
+      <w:rPr>
+        <w:rFonts w:ascii="Symbol" w:hAnsi="Symbol" w:hint="default"/>
+        <w:sz w:val="20"/>
+      </w:rPr>
+    </w:lvl>
+    <w:lvl w:ilvl="3" w:tentative="1">
+      <w:start w:val="1"/>
+      <w:numFmt w:val="bullet"/>
+      <w:lvlText w:val=""/>
+      <w:lvlJc w:val="left"/>
+      <w:pPr>
+        <w:tabs>
+          <w:tab w:val="num" w:pos="2880"/>
+        </w:tabs>
+        <w:ind w:left="2880" w:hanging="360"/>
+      </w:pPr>
+      <w:rPr>
+        <w:rFonts w:ascii="Symbol" w:hAnsi="Symbol" w:hint="default"/>
+        <w:sz w:val="20"/>
+      </w:rPr>
+    </w:lvl>
+    <w:lvl w:ilvl="4" w:tentative="1">
+      <w:start w:val="1"/>
+      <w:numFmt w:val="bullet"/>
+      <w:lvlText w:val=""/>
+      <w:lvlJc w:val="left"/>
+      <w:pPr>
+        <w:tabs>
+          <w:tab w:val="num" w:pos="3600"/>
+        </w:tabs>
+        <w:ind w:left="3600" w:hanging="360"/>
+      </w:pPr>
+      <w:rPr>
+        <w:rFonts w:ascii="Symbol" w:hAnsi="Symbol" w:hint="default"/>
+        <w:sz w:val="20"/>
+      </w:rPr>
+    </w:lvl>
+    <w:lvl w:ilvl="5" w:tentative="1">
+      <w:start w:val="1"/>
+      <w:numFmt w:val="bullet"/>
+      <w:lvlText w:val=""/>
+      <w:lvlJc w:val="left"/>
+      <w:pPr>
+        <w:tabs>
+          <w:tab w:val="num" w:pos="4320"/>
+        </w:tabs>
+        <w:ind w:left="4320" w:hanging="360"/>
+      </w:pPr>
+      <w:rPr>
+        <w:rFonts w:ascii="Symbol" w:hAnsi="Symbol" w:hint="default"/>
+        <w:sz w:val="20"/>
+      </w:rPr>
+    </w:lvl>
+    <w:lvl w:ilvl="6" w:tentative="1">
+      <w:start w:val="1"/>
+      <w:numFmt w:val="bullet"/>
+      <w:lvlText w:val=""/>
+      <w:lvlJc w:val="left"/>
+      <w:pPr>
+        <w:tabs>
+          <w:tab w:val="num" w:pos="5040"/>
+        </w:tabs>
+        <w:ind w:left="5040" w:hanging="360"/>
+      </w:pPr>
+      <w:rPr>
+        <w:rFonts w:ascii="Symbol" w:hAnsi="Symbol" w:hint="default"/>
+        <w:sz w:val="20"/>
+      </w:rPr>
+    </w:lvl>
+    <w:lvl w:ilvl="7" w:tentative="1">
+      <w:start w:val="1"/>
+      <w:numFmt w:val="bullet"/>
+      <w:lvlText w:val=""/>
+      <w:lvlJc w:val="left"/>
+      <w:pPr>
+        <w:tabs>
+          <w:tab w:val="num" w:pos="5760"/>
+        </w:tabs>
+        <w:ind w:left="5760" w:hanging="360"/>
+      </w:pPr>
+      <w:rPr>
+        <w:rFonts w:ascii="Symbol" w:hAnsi="Symbol" w:hint="default"/>
+        <w:sz w:val="20"/>
+      </w:rPr>
+    </w:lvl>
+    <w:lvl w:ilvl="8" w:tentative="1">
+      <w:start w:val="1"/>
+      <w:numFmt w:val="bullet"/>
+      <w:lvlText w:val=""/>
+      <w:lvlJc w:val="left"/>
+      <w:pPr>
+        <w:tabs>
+          <w:tab w:val="num" w:pos="6480"/>
+        </w:tabs>
+        <w:ind w:left="6480" w:hanging="360"/>
+      </w:pPr>
+      <w:rPr>
+        <w:rFonts w:ascii="Symbol" w:hAnsi="Symbol" w:hint="default"/>
+        <w:sz w:val="20"/>
+      </w:rPr>
+    </w:lvl>
+  </w:abstractNum>
+  <w:abstractNum w:abstractNumId="14" w15:restartNumberingAfterBreak="0">
+    <w:nsid w:val="5C5F6818"/>
+    <w:multiLevelType w:val="multilevel"/>
+    <w:tmpl w:val="631C80A0"/>
+    <w:lvl w:ilvl="0">
+      <w:start w:val="1"/>
+      <w:numFmt w:val="bullet"/>
+      <w:lvlText w:val=""/>
+      <w:lvlJc w:val="left"/>
+      <w:pPr>
+        <w:tabs>
+          <w:tab w:val="num" w:pos="720"/>
+        </w:tabs>
+        <w:ind w:left="720" w:hanging="360"/>
+      </w:pPr>
+      <w:rPr>
+        <w:rFonts w:ascii="Symbol" w:hAnsi="Symbol" w:hint="default"/>
+        <w:sz w:val="20"/>
+      </w:rPr>
+    </w:lvl>
+    <w:lvl w:ilvl="1" w:tentative="1">
+      <w:start w:val="1"/>
+      <w:numFmt w:val="bullet"/>
+      <w:lvlText w:val=""/>
+      <w:lvlJc w:val="left"/>
+      <w:pPr>
+        <w:tabs>
+          <w:tab w:val="num" w:pos="1440"/>
+        </w:tabs>
+        <w:ind w:left="1440" w:hanging="360"/>
+      </w:pPr>
+      <w:rPr>
+        <w:rFonts w:ascii="Symbol" w:hAnsi="Symbol" w:hint="default"/>
+        <w:sz w:val="20"/>
+      </w:rPr>
+    </w:lvl>
+    <w:lvl w:ilvl="2" w:tentative="1">
+      <w:start w:val="1"/>
+      <w:numFmt w:val="bullet"/>
+      <w:lvlText w:val=""/>
+      <w:lvlJc w:val="left"/>
+      <w:pPr>
+        <w:tabs>
+          <w:tab w:val="num" w:pos="2160"/>
+        </w:tabs>
+        <w:ind w:left="2160" w:hanging="360"/>
+      </w:pPr>
+      <w:rPr>
+        <w:rFonts w:ascii="Symbol" w:hAnsi="Symbol" w:hint="default"/>
+        <w:sz w:val="20"/>
+      </w:rPr>
+    </w:lvl>
+    <w:lvl w:ilvl="3" w:tentative="1">
+      <w:start w:val="1"/>
+      <w:numFmt w:val="bullet"/>
+      <w:lvlText w:val=""/>
+      <w:lvlJc w:val="left"/>
+      <w:pPr>
+        <w:tabs>
+          <w:tab w:val="num" w:pos="2880"/>
+        </w:tabs>
+        <w:ind w:left="2880" w:hanging="360"/>
+      </w:pPr>
+      <w:rPr>
+        <w:rFonts w:ascii="Symbol" w:hAnsi="Symbol" w:hint="default"/>
+        <w:sz w:val="20"/>
+      </w:rPr>
+    </w:lvl>
+    <w:lvl w:ilvl="4" w:tentative="1">
+      <w:start w:val="1"/>
+      <w:numFmt w:val="bullet"/>
+      <w:lvlText w:val=""/>
+      <w:lvlJc w:val="left"/>
+      <w:pPr>
+        <w:tabs>
+          <w:tab w:val="num" w:pos="3600"/>
+        </w:tabs>
+        <w:ind w:left="3600" w:hanging="360"/>
+      </w:pPr>
+      <w:rPr>
+        <w:rFonts w:ascii="Symbol" w:hAnsi="Symbol" w:hint="default"/>
+        <w:sz w:val="20"/>
+      </w:rPr>
+    </w:lvl>
+    <w:lvl w:ilvl="5" w:tentative="1">
+      <w:start w:val="1"/>
+      <w:numFmt w:val="bullet"/>
+      <w:lvlText w:val=""/>
+      <w:lvlJc w:val="left"/>
+      <w:pPr>
+        <w:tabs>
+          <w:tab w:val="num" w:pos="4320"/>
+        </w:tabs>
+        <w:ind w:left="4320" w:hanging="360"/>
+      </w:pPr>
+      <w:rPr>
+        <w:rFonts w:ascii="Symbol" w:hAnsi="Symbol" w:hint="default"/>
+        <w:sz w:val="20"/>
+      </w:rPr>
+    </w:lvl>
+    <w:lvl w:ilvl="6" w:tentative="1">
+      <w:start w:val="1"/>
+      <w:numFmt w:val="bullet"/>
+      <w:lvlText w:val=""/>
+      <w:lvlJc w:val="left"/>
+      <w:pPr>
+        <w:tabs>
+          <w:tab w:val="num" w:pos="5040"/>
+        </w:tabs>
+        <w:ind w:left="5040" w:hanging="360"/>
+      </w:pPr>
+      <w:rPr>
+        <w:rFonts w:ascii="Symbol" w:hAnsi="Symbol" w:hint="default"/>
+        <w:sz w:val="20"/>
+      </w:rPr>
+    </w:lvl>
+    <w:lvl w:ilvl="7" w:tentative="1">
+      <w:start w:val="1"/>
+      <w:numFmt w:val="bullet"/>
+      <w:lvlText w:val=""/>
+      <w:lvlJc w:val="left"/>
+      <w:pPr>
+        <w:tabs>
+          <w:tab w:val="num" w:pos="5760"/>
+        </w:tabs>
+        <w:ind w:left="5760" w:hanging="360"/>
+      </w:pPr>
+      <w:rPr>
+        <w:rFonts w:ascii="Symbol" w:hAnsi="Symbol" w:hint="default"/>
+        <w:sz w:val="20"/>
+      </w:rPr>
+    </w:lvl>
+    <w:lvl w:ilvl="8" w:tentative="1">
+      <w:start w:val="1"/>
+      <w:numFmt w:val="bullet"/>
+      <w:lvlText w:val=""/>
+      <w:lvlJc w:val="left"/>
+      <w:pPr>
+        <w:tabs>
+          <w:tab w:val="num" w:pos="6480"/>
+        </w:tabs>
+        <w:ind w:left="6480" w:hanging="360"/>
+      </w:pPr>
+      <w:rPr>
+        <w:rFonts w:ascii="Symbol" w:hAnsi="Symbol" w:hint="default"/>
+        <w:sz w:val="20"/>
+      </w:rPr>
+    </w:lvl>
+  </w:abstractNum>
+  <w:abstractNum w:abstractNumId="15" w15:restartNumberingAfterBreak="0">
     <w:nsid w:val="5D263349"/>
     <w:multiLevelType w:val="multilevel"/>
     <w:tmpl w:val="7EFAB1B0"/>
@@ -1542,7 +3459,7 @@
       </w:rPr>
     </w:lvl>
   </w:abstractNum>
-  <w:abstractNum w:abstractNumId="6" w15:restartNumberingAfterBreak="0">
+  <w:abstractNum w:abstractNumId="16" w15:restartNumberingAfterBreak="0">
     <w:nsid w:val="5F934ED7"/>
     <w:multiLevelType w:val="multilevel"/>
     <w:tmpl w:val="A274C014"/>
@@ -1691,7 +3608,454 @@
       </w:rPr>
     </w:lvl>
   </w:abstractNum>
-  <w:abstractNum w:abstractNumId="7" w15:restartNumberingAfterBreak="0">
+  <w:abstractNum w:abstractNumId="17" w15:restartNumberingAfterBreak="0">
+    <w:nsid w:val="6127580A"/>
+    <w:multiLevelType w:val="multilevel"/>
+    <w:tmpl w:val="8D0A2714"/>
+    <w:lvl w:ilvl="0">
+      <w:start w:val="1"/>
+      <w:numFmt w:val="bullet"/>
+      <w:lvlText w:val=""/>
+      <w:lvlJc w:val="left"/>
+      <w:pPr>
+        <w:tabs>
+          <w:tab w:val="num" w:pos="720"/>
+        </w:tabs>
+        <w:ind w:left="720" w:hanging="360"/>
+      </w:pPr>
+      <w:rPr>
+        <w:rFonts w:ascii="Symbol" w:hAnsi="Symbol" w:hint="default"/>
+        <w:sz w:val="20"/>
+      </w:rPr>
+    </w:lvl>
+    <w:lvl w:ilvl="1" w:tentative="1">
+      <w:start w:val="1"/>
+      <w:numFmt w:val="bullet"/>
+      <w:lvlText w:val=""/>
+      <w:lvlJc w:val="left"/>
+      <w:pPr>
+        <w:tabs>
+          <w:tab w:val="num" w:pos="1440"/>
+        </w:tabs>
+        <w:ind w:left="1440" w:hanging="360"/>
+      </w:pPr>
+      <w:rPr>
+        <w:rFonts w:ascii="Symbol" w:hAnsi="Symbol" w:hint="default"/>
+        <w:sz w:val="20"/>
+      </w:rPr>
+    </w:lvl>
+    <w:lvl w:ilvl="2" w:tentative="1">
+      <w:start w:val="1"/>
+      <w:numFmt w:val="bullet"/>
+      <w:lvlText w:val=""/>
+      <w:lvlJc w:val="left"/>
+      <w:pPr>
+        <w:tabs>
+          <w:tab w:val="num" w:pos="2160"/>
+        </w:tabs>
+        <w:ind w:left="2160" w:hanging="360"/>
+      </w:pPr>
+      <w:rPr>
+        <w:rFonts w:ascii="Symbol" w:hAnsi="Symbol" w:hint="default"/>
+        <w:sz w:val="20"/>
+      </w:rPr>
+    </w:lvl>
+    <w:lvl w:ilvl="3" w:tentative="1">
+      <w:start w:val="1"/>
+      <w:numFmt w:val="bullet"/>
+      <w:lvlText w:val=""/>
+      <w:lvlJc w:val="left"/>
+      <w:pPr>
+        <w:tabs>
+          <w:tab w:val="num" w:pos="2880"/>
+        </w:tabs>
+        <w:ind w:left="2880" w:hanging="360"/>
+      </w:pPr>
+      <w:rPr>
+        <w:rFonts w:ascii="Symbol" w:hAnsi="Symbol" w:hint="default"/>
+        <w:sz w:val="20"/>
+      </w:rPr>
+    </w:lvl>
+    <w:lvl w:ilvl="4" w:tentative="1">
+      <w:start w:val="1"/>
+      <w:numFmt w:val="bullet"/>
+      <w:lvlText w:val=""/>
+      <w:lvlJc w:val="left"/>
+      <w:pPr>
+        <w:tabs>
+          <w:tab w:val="num" w:pos="3600"/>
+        </w:tabs>
+        <w:ind w:left="3600" w:hanging="360"/>
+      </w:pPr>
+      <w:rPr>
+        <w:rFonts w:ascii="Symbol" w:hAnsi="Symbol" w:hint="default"/>
+        <w:sz w:val="20"/>
+      </w:rPr>
+    </w:lvl>
+    <w:lvl w:ilvl="5" w:tentative="1">
+      <w:start w:val="1"/>
+      <w:numFmt w:val="bullet"/>
+      <w:lvlText w:val=""/>
+      <w:lvlJc w:val="left"/>
+      <w:pPr>
+        <w:tabs>
+          <w:tab w:val="num" w:pos="4320"/>
+        </w:tabs>
+        <w:ind w:left="4320" w:hanging="360"/>
+      </w:pPr>
+      <w:rPr>
+        <w:rFonts w:ascii="Symbol" w:hAnsi="Symbol" w:hint="default"/>
+        <w:sz w:val="20"/>
+      </w:rPr>
+    </w:lvl>
+    <w:lvl w:ilvl="6" w:tentative="1">
+      <w:start w:val="1"/>
+      <w:numFmt w:val="bullet"/>
+      <w:lvlText w:val=""/>
+      <w:lvlJc w:val="left"/>
+      <w:pPr>
+        <w:tabs>
+          <w:tab w:val="num" w:pos="5040"/>
+        </w:tabs>
+        <w:ind w:left="5040" w:hanging="360"/>
+      </w:pPr>
+      <w:rPr>
+        <w:rFonts w:ascii="Symbol" w:hAnsi="Symbol" w:hint="default"/>
+        <w:sz w:val="20"/>
+      </w:rPr>
+    </w:lvl>
+    <w:lvl w:ilvl="7" w:tentative="1">
+      <w:start w:val="1"/>
+      <w:numFmt w:val="bullet"/>
+      <w:lvlText w:val=""/>
+      <w:lvlJc w:val="left"/>
+      <w:pPr>
+        <w:tabs>
+          <w:tab w:val="num" w:pos="5760"/>
+        </w:tabs>
+        <w:ind w:left="5760" w:hanging="360"/>
+      </w:pPr>
+      <w:rPr>
+        <w:rFonts w:ascii="Symbol" w:hAnsi="Symbol" w:hint="default"/>
+        <w:sz w:val="20"/>
+      </w:rPr>
+    </w:lvl>
+    <w:lvl w:ilvl="8" w:tentative="1">
+      <w:start w:val="1"/>
+      <w:numFmt w:val="bullet"/>
+      <w:lvlText w:val=""/>
+      <w:lvlJc w:val="left"/>
+      <w:pPr>
+        <w:tabs>
+          <w:tab w:val="num" w:pos="6480"/>
+        </w:tabs>
+        <w:ind w:left="6480" w:hanging="360"/>
+      </w:pPr>
+      <w:rPr>
+        <w:rFonts w:ascii="Symbol" w:hAnsi="Symbol" w:hint="default"/>
+        <w:sz w:val="20"/>
+      </w:rPr>
+    </w:lvl>
+  </w:abstractNum>
+  <w:abstractNum w:abstractNumId="18" w15:restartNumberingAfterBreak="0">
+    <w:nsid w:val="6E3B2075"/>
+    <w:multiLevelType w:val="multilevel"/>
+    <w:tmpl w:val="C544655A"/>
+    <w:lvl w:ilvl="0">
+      <w:start w:val="1"/>
+      <w:numFmt w:val="bullet"/>
+      <w:lvlText w:val=""/>
+      <w:lvlJc w:val="left"/>
+      <w:pPr>
+        <w:tabs>
+          <w:tab w:val="num" w:pos="720"/>
+        </w:tabs>
+        <w:ind w:left="720" w:hanging="360"/>
+      </w:pPr>
+      <w:rPr>
+        <w:rFonts w:ascii="Symbol" w:hAnsi="Symbol" w:hint="default"/>
+        <w:sz w:val="20"/>
+      </w:rPr>
+    </w:lvl>
+    <w:lvl w:ilvl="1" w:tentative="1">
+      <w:start w:val="1"/>
+      <w:numFmt w:val="bullet"/>
+      <w:lvlText w:val=""/>
+      <w:lvlJc w:val="left"/>
+      <w:pPr>
+        <w:tabs>
+          <w:tab w:val="num" w:pos="1440"/>
+        </w:tabs>
+        <w:ind w:left="1440" w:hanging="360"/>
+      </w:pPr>
+      <w:rPr>
+        <w:rFonts w:ascii="Symbol" w:hAnsi="Symbol" w:hint="default"/>
+        <w:sz w:val="20"/>
+      </w:rPr>
+    </w:lvl>
+    <w:lvl w:ilvl="2" w:tentative="1">
+      <w:start w:val="1"/>
+      <w:numFmt w:val="bullet"/>
+      <w:lvlText w:val=""/>
+      <w:lvlJc w:val="left"/>
+      <w:pPr>
+        <w:tabs>
+          <w:tab w:val="num" w:pos="2160"/>
+        </w:tabs>
+        <w:ind w:left="2160" w:hanging="360"/>
+      </w:pPr>
+      <w:rPr>
+        <w:rFonts w:ascii="Symbol" w:hAnsi="Symbol" w:hint="default"/>
+        <w:sz w:val="20"/>
+      </w:rPr>
+    </w:lvl>
+    <w:lvl w:ilvl="3" w:tentative="1">
+      <w:start w:val="1"/>
+      <w:numFmt w:val="bullet"/>
+      <w:lvlText w:val=""/>
+      <w:lvlJc w:val="left"/>
+      <w:pPr>
+        <w:tabs>
+          <w:tab w:val="num" w:pos="2880"/>
+        </w:tabs>
+        <w:ind w:left="2880" w:hanging="360"/>
+      </w:pPr>
+      <w:rPr>
+        <w:rFonts w:ascii="Symbol" w:hAnsi="Symbol" w:hint="default"/>
+        <w:sz w:val="20"/>
+      </w:rPr>
+    </w:lvl>
+    <w:lvl w:ilvl="4" w:tentative="1">
+      <w:start w:val="1"/>
+      <w:numFmt w:val="bullet"/>
+      <w:lvlText w:val=""/>
+      <w:lvlJc w:val="left"/>
+      <w:pPr>
+        <w:tabs>
+          <w:tab w:val="num" w:pos="3600"/>
+        </w:tabs>
+        <w:ind w:left="3600" w:hanging="360"/>
+      </w:pPr>
+      <w:rPr>
+        <w:rFonts w:ascii="Symbol" w:hAnsi="Symbol" w:hint="default"/>
+        <w:sz w:val="20"/>
+      </w:rPr>
+    </w:lvl>
+    <w:lvl w:ilvl="5" w:tentative="1">
+      <w:start w:val="1"/>
+      <w:numFmt w:val="bullet"/>
+      <w:lvlText w:val=""/>
+      <w:lvlJc w:val="left"/>
+      <w:pPr>
+        <w:tabs>
+          <w:tab w:val="num" w:pos="4320"/>
+        </w:tabs>
+        <w:ind w:left="4320" w:hanging="360"/>
+      </w:pPr>
+      <w:rPr>
+        <w:rFonts w:ascii="Symbol" w:hAnsi="Symbol" w:hint="default"/>
+        <w:sz w:val="20"/>
+      </w:rPr>
+    </w:lvl>
+    <w:lvl w:ilvl="6" w:tentative="1">
+      <w:start w:val="1"/>
+      <w:numFmt w:val="bullet"/>
+      <w:lvlText w:val=""/>
+      <w:lvlJc w:val="left"/>
+      <w:pPr>
+        <w:tabs>
+          <w:tab w:val="num" w:pos="5040"/>
+        </w:tabs>
+        <w:ind w:left="5040" w:hanging="360"/>
+      </w:pPr>
+      <w:rPr>
+        <w:rFonts w:ascii="Symbol" w:hAnsi="Symbol" w:hint="default"/>
+        <w:sz w:val="20"/>
+      </w:rPr>
+    </w:lvl>
+    <w:lvl w:ilvl="7" w:tentative="1">
+      <w:start w:val="1"/>
+      <w:numFmt w:val="bullet"/>
+      <w:lvlText w:val=""/>
+      <w:lvlJc w:val="left"/>
+      <w:pPr>
+        <w:tabs>
+          <w:tab w:val="num" w:pos="5760"/>
+        </w:tabs>
+        <w:ind w:left="5760" w:hanging="360"/>
+      </w:pPr>
+      <w:rPr>
+        <w:rFonts w:ascii="Symbol" w:hAnsi="Symbol" w:hint="default"/>
+        <w:sz w:val="20"/>
+      </w:rPr>
+    </w:lvl>
+    <w:lvl w:ilvl="8" w:tentative="1">
+      <w:start w:val="1"/>
+      <w:numFmt w:val="bullet"/>
+      <w:lvlText w:val=""/>
+      <w:lvlJc w:val="left"/>
+      <w:pPr>
+        <w:tabs>
+          <w:tab w:val="num" w:pos="6480"/>
+        </w:tabs>
+        <w:ind w:left="6480" w:hanging="360"/>
+      </w:pPr>
+      <w:rPr>
+        <w:rFonts w:ascii="Symbol" w:hAnsi="Symbol" w:hint="default"/>
+        <w:sz w:val="20"/>
+      </w:rPr>
+    </w:lvl>
+  </w:abstractNum>
+  <w:abstractNum w:abstractNumId="19" w15:restartNumberingAfterBreak="0">
+    <w:nsid w:val="767E1E00"/>
+    <w:multiLevelType w:val="multilevel"/>
+    <w:tmpl w:val="27868F14"/>
+    <w:lvl w:ilvl="0">
+      <w:start w:val="1"/>
+      <w:numFmt w:val="bullet"/>
+      <w:lvlText w:val=""/>
+      <w:lvlJc w:val="left"/>
+      <w:pPr>
+        <w:tabs>
+          <w:tab w:val="num" w:pos="720"/>
+        </w:tabs>
+        <w:ind w:left="720" w:hanging="360"/>
+      </w:pPr>
+      <w:rPr>
+        <w:rFonts w:ascii="Symbol" w:hAnsi="Symbol" w:hint="default"/>
+        <w:sz w:val="20"/>
+      </w:rPr>
+    </w:lvl>
+    <w:lvl w:ilvl="1" w:tentative="1">
+      <w:start w:val="1"/>
+      <w:numFmt w:val="bullet"/>
+      <w:lvlText w:val=""/>
+      <w:lvlJc w:val="left"/>
+      <w:pPr>
+        <w:tabs>
+          <w:tab w:val="num" w:pos="1440"/>
+        </w:tabs>
+        <w:ind w:left="1440" w:hanging="360"/>
+      </w:pPr>
+      <w:rPr>
+        <w:rFonts w:ascii="Symbol" w:hAnsi="Symbol" w:hint="default"/>
+        <w:sz w:val="20"/>
+      </w:rPr>
+    </w:lvl>
+    <w:lvl w:ilvl="2" w:tentative="1">
+      <w:start w:val="1"/>
+      <w:numFmt w:val="bullet"/>
+      <w:lvlText w:val=""/>
+      <w:lvlJc w:val="left"/>
+      <w:pPr>
+        <w:tabs>
+          <w:tab w:val="num" w:pos="2160"/>
+        </w:tabs>
+        <w:ind w:left="2160" w:hanging="360"/>
+      </w:pPr>
+      <w:rPr>
+        <w:rFonts w:ascii="Symbol" w:hAnsi="Symbol" w:hint="default"/>
+        <w:sz w:val="20"/>
+      </w:rPr>
+    </w:lvl>
+    <w:lvl w:ilvl="3" w:tentative="1">
+      <w:start w:val="1"/>
+      <w:numFmt w:val="bullet"/>
+      <w:lvlText w:val=""/>
+      <w:lvlJc w:val="left"/>
+      <w:pPr>
+        <w:tabs>
+          <w:tab w:val="num" w:pos="2880"/>
+        </w:tabs>
+        <w:ind w:left="2880" w:hanging="360"/>
+      </w:pPr>
+      <w:rPr>
+        <w:rFonts w:ascii="Symbol" w:hAnsi="Symbol" w:hint="default"/>
+        <w:sz w:val="20"/>
+      </w:rPr>
+    </w:lvl>
+    <w:lvl w:ilvl="4" w:tentative="1">
+      <w:start w:val="1"/>
+      <w:numFmt w:val="bullet"/>
+      <w:lvlText w:val=""/>
+      <w:lvlJc w:val="left"/>
+      <w:pPr>
+        <w:tabs>
+          <w:tab w:val="num" w:pos="3600"/>
+        </w:tabs>
+        <w:ind w:left="3600" w:hanging="360"/>
+      </w:pPr>
+      <w:rPr>
+        <w:rFonts w:ascii="Symbol" w:hAnsi="Symbol" w:hint="default"/>
+        <w:sz w:val="20"/>
+      </w:rPr>
+    </w:lvl>
+    <w:lvl w:ilvl="5" w:tentative="1">
+      <w:start w:val="1"/>
+      <w:numFmt w:val="bullet"/>
+      <w:lvlText w:val=""/>
+      <w:lvlJc w:val="left"/>
+      <w:pPr>
+        <w:tabs>
+          <w:tab w:val="num" w:pos="4320"/>
+        </w:tabs>
+        <w:ind w:left="4320" w:hanging="360"/>
+      </w:pPr>
+      <w:rPr>
+        <w:rFonts w:ascii="Symbol" w:hAnsi="Symbol" w:hint="default"/>
+        <w:sz w:val="20"/>
+      </w:rPr>
+    </w:lvl>
+    <w:lvl w:ilvl="6" w:tentative="1">
+      <w:start w:val="1"/>
+      <w:numFmt w:val="bullet"/>
+      <w:lvlText w:val=""/>
+      <w:lvlJc w:val="left"/>
+      <w:pPr>
+        <w:tabs>
+          <w:tab w:val="num" w:pos="5040"/>
+        </w:tabs>
+        <w:ind w:left="5040" w:hanging="360"/>
+      </w:pPr>
+      <w:rPr>
+        <w:rFonts w:ascii="Symbol" w:hAnsi="Symbol" w:hint="default"/>
+        <w:sz w:val="20"/>
+      </w:rPr>
+    </w:lvl>
+    <w:lvl w:ilvl="7" w:tentative="1">
+      <w:start w:val="1"/>
+      <w:numFmt w:val="bullet"/>
+      <w:lvlText w:val=""/>
+      <w:lvlJc w:val="left"/>
+      <w:pPr>
+        <w:tabs>
+          <w:tab w:val="num" w:pos="5760"/>
+        </w:tabs>
+        <w:ind w:left="5760" w:hanging="360"/>
+      </w:pPr>
+      <w:rPr>
+        <w:rFonts w:ascii="Symbol" w:hAnsi="Symbol" w:hint="default"/>
+        <w:sz w:val="20"/>
+      </w:rPr>
+    </w:lvl>
+    <w:lvl w:ilvl="8" w:tentative="1">
+      <w:start w:val="1"/>
+      <w:numFmt w:val="bullet"/>
+      <w:lvlText w:val=""/>
+      <w:lvlJc w:val="left"/>
+      <w:pPr>
+        <w:tabs>
+          <w:tab w:val="num" w:pos="6480"/>
+        </w:tabs>
+        <w:ind w:left="6480" w:hanging="360"/>
+      </w:pPr>
+      <w:rPr>
+        <w:rFonts w:ascii="Symbol" w:hAnsi="Symbol" w:hint="default"/>
+        <w:sz w:val="20"/>
+      </w:rPr>
+    </w:lvl>
+  </w:abstractNum>
+  <w:abstractNum w:abstractNumId="20" w15:restartNumberingAfterBreak="0">
     <w:nsid w:val="779A2492"/>
     <w:multiLevelType w:val="multilevel"/>
     <w:tmpl w:val="5B9AB724"/>
@@ -1841,28 +4205,67 @@
     </w:lvl>
   </w:abstractNum>
   <w:num w:numId="1" w16cid:durableId="388192063">
+    <w:abstractNumId w:val="15"/>
+  </w:num>
+  <w:num w:numId="2" w16cid:durableId="459036417">
+    <w:abstractNumId w:val="16"/>
+  </w:num>
+  <w:num w:numId="3" w16cid:durableId="1770546944">
+    <w:abstractNumId w:val="2"/>
+  </w:num>
+  <w:num w:numId="4" w16cid:durableId="888538286">
+    <w:abstractNumId w:val="7"/>
+  </w:num>
+  <w:num w:numId="5" w16cid:durableId="809981515">
+    <w:abstractNumId w:val="8"/>
+  </w:num>
+  <w:num w:numId="6" w16cid:durableId="538510628">
+    <w:abstractNumId w:val="11"/>
+  </w:num>
+  <w:num w:numId="7" w16cid:durableId="1039204547">
+    <w:abstractNumId w:val="20"/>
+  </w:num>
+  <w:num w:numId="8" w16cid:durableId="652565624">
+    <w:abstractNumId w:val="6"/>
+  </w:num>
+  <w:num w:numId="9" w16cid:durableId="1242444467">
+    <w:abstractNumId w:val="18"/>
+  </w:num>
+  <w:num w:numId="10" w16cid:durableId="813569081">
+    <w:abstractNumId w:val="10"/>
+  </w:num>
+  <w:num w:numId="11" w16cid:durableId="488139174">
     <w:abstractNumId w:val="5"/>
   </w:num>
-  <w:num w:numId="2" w16cid:durableId="459036417">
-    <w:abstractNumId w:val="6"/>
+  <w:num w:numId="12" w16cid:durableId="2126994818">
+    <w:abstractNumId w:val="14"/>
   </w:num>
-  <w:num w:numId="3" w16cid:durableId="1770546944">
+  <w:num w:numId="13" w16cid:durableId="746998921">
+    <w:abstractNumId w:val="1"/>
+  </w:num>
+  <w:num w:numId="14" w16cid:durableId="1101218549">
+    <w:abstractNumId w:val="12"/>
+  </w:num>
+  <w:num w:numId="15" w16cid:durableId="362171028">
     <w:abstractNumId w:val="0"/>
   </w:num>
-  <w:num w:numId="4" w16cid:durableId="888538286">
-    <w:abstractNumId w:val="2"/>
+  <w:num w:numId="16" w16cid:durableId="977302902">
+    <w:abstractNumId w:val="17"/>
   </w:num>
-  <w:num w:numId="5" w16cid:durableId="809981515">
+  <w:num w:numId="17" w16cid:durableId="1320765988">
+    <w:abstractNumId w:val="19"/>
+  </w:num>
+  <w:num w:numId="18" w16cid:durableId="995105496">
     <w:abstractNumId w:val="3"/>
   </w:num>
-  <w:num w:numId="6" w16cid:durableId="538510628">
+  <w:num w:numId="19" w16cid:durableId="2055499498">
     <w:abstractNumId w:val="4"/>
   </w:num>
-  <w:num w:numId="7" w16cid:durableId="1039204547">
-    <w:abstractNumId w:val="7"/>
+  <w:num w:numId="20" w16cid:durableId="957759793">
+    <w:abstractNumId w:val="13"/>
   </w:num>
-  <w:num w:numId="8" w16cid:durableId="652565624">
-    <w:abstractNumId w:val="1"/>
+  <w:num w:numId="21" w16cid:durableId="1692754110">
+    <w:abstractNumId w:val="9"/>
   </w:num>
 </w:numbering>
 </file>
@@ -2267,7 +4670,7 @@
   <w:style w:type="paragraph" w:default="1" w:styleId="Normal">
     <w:name w:val="Normal"/>
     <w:qFormat/>
-    <w:rsid w:val="00C3051D"/>
+    <w:rsid w:val="000B3011"/>
   </w:style>
   <w:style w:type="paragraph" w:styleId="Heading1">
     <w:name w:val="heading 1"/>
@@ -3103,4 +5506,10 @@
     </a:ext>
   </a:extLst>
 </a:theme>
+</file>
+
+<file path=docMetadata/LabelInfo.xml><?xml version="1.0" encoding="utf-8"?>
+<clbl:labelList xmlns:clbl="http://schemas.microsoft.com/office/2020/mipLabelMetadata">
+  <clbl:label id="{3b23c674-de8a-426d-bc8b-74ad6594a910}" enabled="1" method="Standard" siteId="{c5d0ad88-8f93-43b8-9b7c-c8a3bb8e410a}" contentBits="0" removed="0"/>
+</clbl:labelList>
 </file>
</xml_diff>